<commit_message>
Avance 13 de setiembre
- Pestañas en python (ubicaciones, disponibilidades) 
- Documentación de creación de tablas (ubicaciones, disponibilidades, tareas) y llaves foráneas en base de datos
</commit_message>
<xml_diff>
--- a/Proyecto.docx
+++ b/Proyecto.docx
@@ -477,21 +477,12 @@
           <w:lang w:val="fr-FR"/>
         </w:rPr>
       </w:pPr>
-      <w:proofErr w:type="spellStart"/>
       <w:r>
         <w:rPr>
           <w:rFonts w:ascii="Arial" w:eastAsia="Arial" w:hAnsi="Arial" w:cs="Arial"/>
           <w:lang w:val="fr-FR"/>
         </w:rPr>
-        <w:t>Ing</w:t>
-      </w:r>
-      <w:proofErr w:type="spellEnd"/>
-      <w:r>
-        <w:rPr>
-          <w:rFonts w:ascii="Arial" w:eastAsia="Arial" w:hAnsi="Arial" w:cs="Arial"/>
-          <w:lang w:val="fr-FR"/>
-        </w:rPr>
-        <w:t>. Jacqueline Solís Céspedes</w:t>
+        <w:t>Ing. Jacqueline Solís Céspedes</w:t>
       </w:r>
     </w:p>
     <w:p>
@@ -877,41 +868,13 @@
                 <w:iCs/>
               </w:rPr>
             </w:pPr>
-            <w:proofErr w:type="spellStart"/>
             <w:r>
               <w:rPr>
                 <w:rFonts w:ascii="Arial" w:eastAsia="Arial" w:hAnsi="Arial" w:cs="Arial"/>
                 <w:i/>
                 <w:iCs/>
               </w:rPr>
-              <w:t>id_ubicacion</w:t>
-            </w:r>
-            <w:proofErr w:type="spellEnd"/>
-            <w:r>
-              <w:rPr>
-                <w:rFonts w:ascii="Arial" w:eastAsia="Arial" w:hAnsi="Arial" w:cs="Arial"/>
-                <w:i/>
-                <w:iCs/>
-              </w:rPr>
-              <w:t xml:space="preserve">: Identificador único </w:t>
-            </w:r>
-            <w:proofErr w:type="spellStart"/>
-            <w:r>
-              <w:rPr>
-                <w:rFonts w:ascii="Arial" w:eastAsia="Arial" w:hAnsi="Arial" w:cs="Arial"/>
-                <w:i/>
-                <w:iCs/>
-              </w:rPr>
-              <w:t>autoincrementable</w:t>
-            </w:r>
-            <w:proofErr w:type="spellEnd"/>
-            <w:r>
-              <w:rPr>
-                <w:rFonts w:ascii="Arial" w:eastAsia="Arial" w:hAnsi="Arial" w:cs="Arial"/>
-                <w:i/>
-                <w:iCs/>
-              </w:rPr>
-              <w:t xml:space="preserve"> de la ubicación.</w:t>
+              <w:t>id_ubicacion: Identificador único autoincrementable de la ubicación.</w:t>
             </w:r>
           </w:p>
           <w:p>
@@ -959,23 +922,13 @@
                 <w:iCs/>
               </w:rPr>
             </w:pPr>
-            <w:proofErr w:type="spellStart"/>
             <w:r>
               <w:rPr>
                 <w:rFonts w:ascii="Arial" w:eastAsia="Arial" w:hAnsi="Arial" w:cs="Arial"/>
                 <w:i/>
                 <w:iCs/>
               </w:rPr>
-              <w:t>direccion</w:t>
-            </w:r>
-            <w:proofErr w:type="spellEnd"/>
-            <w:r>
-              <w:rPr>
-                <w:rFonts w:ascii="Arial" w:eastAsia="Arial" w:hAnsi="Arial" w:cs="Arial"/>
-                <w:i/>
-                <w:iCs/>
-              </w:rPr>
-              <w:t>: Dirección física o señas exactas del recinto.</w:t>
+              <w:t>direccion: Dirección física o señas exactas del recinto.</w:t>
             </w:r>
           </w:p>
           <w:p>
@@ -1089,21 +1042,7 @@
               <w:rPr>
                 <w:rFonts w:ascii="Arial" w:eastAsia="Arial" w:hAnsi="Arial" w:cs="Arial"/>
               </w:rPr>
-              <w:t xml:space="preserve"> nombre, dirección, ciudad, capacidad y </w:t>
-            </w:r>
-            <w:proofErr w:type="spellStart"/>
-            <w:r>
-              <w:rPr>
-                <w:rFonts w:ascii="Arial" w:eastAsia="Arial" w:hAnsi="Arial" w:cs="Arial"/>
-              </w:rPr>
-              <w:t>id_ubicacion</w:t>
-            </w:r>
-            <w:proofErr w:type="spellEnd"/>
-            <w:r>
-              <w:rPr>
-                <w:rFonts w:ascii="Arial" w:eastAsia="Arial" w:hAnsi="Arial" w:cs="Arial"/>
-              </w:rPr>
-              <w:t>, este último subrayado para identificar que es la llave primaria (PK)</w:t>
+              <w:t xml:space="preserve"> nombre, dirección, ciudad, capacidad y id_ubicacion, este último subrayado para identificar que es la llave primaria (PK)</w:t>
             </w:r>
             <w:r>
               <w:rPr>
@@ -1228,89 +1167,11 @@
                 <w:rFonts w:ascii="Consolas" w:eastAsia="Arial" w:hAnsi="Consolas" w:cs="Arial"/>
               </w:rPr>
             </w:pPr>
-            <w:proofErr w:type="spellStart"/>
-            <w:r>
-              <w:rPr>
-                <w:rFonts w:ascii="Consolas" w:eastAsia="Arial" w:hAnsi="Consolas" w:cs="Arial"/>
-              </w:rPr>
-              <w:t>ubicacion</w:t>
-            </w:r>
-            <w:proofErr w:type="spellEnd"/>
-            <w:r>
-              <w:rPr>
-                <w:rFonts w:ascii="Consolas" w:eastAsia="Arial" w:hAnsi="Consolas" w:cs="Arial"/>
-              </w:rPr>
-              <w:t xml:space="preserve"> (</w:t>
-            </w:r>
-            <w:proofErr w:type="spellStart"/>
-            <w:r>
-              <w:rPr>
-                <w:rFonts w:ascii="Consolas" w:eastAsia="Arial" w:hAnsi="Consolas" w:cs="Arial"/>
-              </w:rPr>
-              <w:t>id_</w:t>
-            </w:r>
-            <w:proofErr w:type="gramStart"/>
-            <w:r>
-              <w:rPr>
-                <w:rFonts w:ascii="Consolas" w:eastAsia="Arial" w:hAnsi="Consolas" w:cs="Arial"/>
-              </w:rPr>
-              <w:t>ubicacion</w:t>
-            </w:r>
-            <w:proofErr w:type="spellEnd"/>
-            <w:r>
-              <w:rPr>
-                <w:rFonts w:ascii="Consolas" w:eastAsia="Arial" w:hAnsi="Consolas" w:cs="Arial"/>
-              </w:rPr>
-              <w:t>[</w:t>
-            </w:r>
-            <w:proofErr w:type="gramEnd"/>
-            <w:r>
-              <w:rPr>
-                <w:rFonts w:ascii="Consolas" w:eastAsia="Arial" w:hAnsi="Consolas" w:cs="Arial"/>
-              </w:rPr>
-              <w:t>PK</w:t>
-            </w:r>
-            <w:proofErr w:type="gramStart"/>
-            <w:r>
-              <w:rPr>
-                <w:rFonts w:ascii="Consolas" w:eastAsia="Arial" w:hAnsi="Consolas" w:cs="Arial"/>
-              </w:rPr>
-              <w:t>],</w:t>
-            </w:r>
-            <w:proofErr w:type="spellStart"/>
-            <w:r>
-              <w:rPr>
-                <w:rFonts w:ascii="Consolas" w:eastAsia="Arial" w:hAnsi="Consolas" w:cs="Arial"/>
-              </w:rPr>
-              <w:t>nombre</w:t>
-            </w:r>
-            <w:proofErr w:type="gramEnd"/>
-            <w:r>
-              <w:rPr>
-                <w:rFonts w:ascii="Consolas" w:eastAsia="Arial" w:hAnsi="Consolas" w:cs="Arial"/>
-              </w:rPr>
-              <w:t>,</w:t>
-            </w:r>
-            <w:proofErr w:type="gramStart"/>
-            <w:r>
-              <w:rPr>
-                <w:rFonts w:ascii="Consolas" w:eastAsia="Arial" w:hAnsi="Consolas" w:cs="Arial"/>
-              </w:rPr>
-              <w:t>dirección,ciudad</w:t>
-            </w:r>
-            <w:proofErr w:type="gramEnd"/>
-            <w:r>
-              <w:rPr>
-                <w:rFonts w:ascii="Consolas" w:eastAsia="Arial" w:hAnsi="Consolas" w:cs="Arial"/>
-              </w:rPr>
-              <w:t>,capacidad</w:t>
-            </w:r>
-            <w:proofErr w:type="spellEnd"/>
-            <w:r>
-              <w:rPr>
-                <w:rFonts w:ascii="Consolas" w:eastAsia="Arial" w:hAnsi="Consolas" w:cs="Arial"/>
-              </w:rPr>
-              <w:t>)</w:t>
+            <w:r>
+              <w:rPr>
+                <w:rFonts w:ascii="Consolas" w:eastAsia="Arial" w:hAnsi="Consolas" w:cs="Arial"/>
+              </w:rPr>
+              <w:t>ubicacion (id_ubicacion[PK],nombre,dirección,ciudad,capacidad)</w:t>
             </w:r>
           </w:p>
         </w:tc>
@@ -1378,21 +1239,7 @@
               <w:rPr>
                 <w:rFonts w:ascii="Arial" w:eastAsia="Arial" w:hAnsi="Arial" w:cs="Arial"/>
               </w:rPr>
-              <w:t xml:space="preserve">, luego se crea cada atributo especificando sus características: el </w:t>
-            </w:r>
-            <w:proofErr w:type="spellStart"/>
-            <w:r>
-              <w:rPr>
-                <w:rFonts w:ascii="Arial" w:eastAsia="Arial" w:hAnsi="Arial" w:cs="Arial"/>
-              </w:rPr>
-              <w:t>id_ubicacion</w:t>
-            </w:r>
-            <w:proofErr w:type="spellEnd"/>
-            <w:r>
-              <w:rPr>
-                <w:rFonts w:ascii="Arial" w:eastAsia="Arial" w:hAnsi="Arial" w:cs="Arial"/>
-              </w:rPr>
-              <w:t xml:space="preserve"> se denota como llave primaria de la entidad y se añade </w:t>
+              <w:t xml:space="preserve">, luego se crea cada atributo especificando sus características: el id_ubicacion se denota como llave primaria de la entidad y se añade </w:t>
             </w:r>
             <w:r>
               <w:rPr>
@@ -1422,19 +1269,7 @@
               <w:rPr>
                 <w:rFonts w:ascii="Arial" w:eastAsia="Arial" w:hAnsi="Arial" w:cs="Arial"/>
               </w:rPr>
-              <w:t>para no guardar específicamente los espacios del paréntesis y se utilicen los necesarios (el 50 es el límite). La capacidad es un número, por tanto</w:t>
-            </w:r>
-            <w:r>
-              <w:rPr>
-                <w:rFonts w:ascii="Arial" w:eastAsia="Arial" w:hAnsi="Arial" w:cs="Arial"/>
-              </w:rPr>
-              <w:t>,</w:t>
-            </w:r>
-            <w:r>
-              <w:rPr>
-                <w:rFonts w:ascii="Arial" w:eastAsia="Arial" w:hAnsi="Arial" w:cs="Arial"/>
-              </w:rPr>
-              <w:t xml:space="preserve"> corresponde al tipo </w:t>
+              <w:t xml:space="preserve">para no guardar específicamente los espacios del paréntesis y se utilicen los necesarios (el 50 es el límite). La capacidad es un número, por tanto, corresponde al tipo </w:t>
             </w:r>
             <w:r>
               <w:rPr>
@@ -1494,93 +1329,54 @@
               <w:rPr>
                 <w:rFonts w:ascii="Consolas" w:eastAsia="Arial" w:hAnsi="Consolas" w:cs="Arial"/>
               </w:rPr>
+              <w:t>    id_ubicacion SERIAL PRIMARY KEY,</w:t>
+            </w:r>
+          </w:p>
+          <w:p>
+            <w:pPr>
+              <w:jc w:val="both"/>
+              <w:rPr>
+                <w:rFonts w:ascii="Consolas" w:eastAsia="Arial" w:hAnsi="Consolas" w:cs="Arial"/>
+              </w:rPr>
+            </w:pPr>
+            <w:r>
+              <w:rPr>
+                <w:rFonts w:ascii="Consolas" w:eastAsia="Arial" w:hAnsi="Consolas" w:cs="Arial"/>
+              </w:rPr>
+              <w:t>    nombre VARCHAR(50) NOT NULL,</w:t>
+            </w:r>
+          </w:p>
+          <w:p>
+            <w:pPr>
+              <w:jc w:val="both"/>
+              <w:rPr>
+                <w:rFonts w:ascii="Consolas" w:eastAsia="Arial" w:hAnsi="Consolas" w:cs="Arial"/>
+              </w:rPr>
+            </w:pPr>
+            <w:r>
+              <w:rPr>
+                <w:rFonts w:ascii="Consolas" w:eastAsia="Arial" w:hAnsi="Consolas" w:cs="Arial"/>
+              </w:rPr>
               <w:t>    </w:t>
             </w:r>
-            <w:proofErr w:type="spellStart"/>
-            <w:r>
-              <w:rPr>
-                <w:rFonts w:ascii="Consolas" w:eastAsia="Arial" w:hAnsi="Consolas" w:cs="Arial"/>
-              </w:rPr>
-              <w:t>id_ubicacion</w:t>
-            </w:r>
-            <w:proofErr w:type="spellEnd"/>
-            <w:r>
-              <w:rPr>
-                <w:rFonts w:ascii="Consolas" w:eastAsia="Arial" w:hAnsi="Consolas" w:cs="Arial"/>
-              </w:rPr>
-              <w:t xml:space="preserve"> SERIAL PRIMARY KEY,</w:t>
-            </w:r>
-          </w:p>
-          <w:p>
-            <w:pPr>
-              <w:jc w:val="both"/>
-              <w:rPr>
-                <w:rFonts w:ascii="Consolas" w:eastAsia="Arial" w:hAnsi="Consolas" w:cs="Arial"/>
-              </w:rPr>
-            </w:pPr>
-            <w:r>
-              <w:rPr>
-                <w:rFonts w:ascii="Consolas" w:eastAsia="Arial" w:hAnsi="Consolas" w:cs="Arial"/>
-              </w:rPr>
-              <w:t xml:space="preserve">    nombre </w:t>
-            </w:r>
-            <w:proofErr w:type="gramStart"/>
-            <w:r>
-              <w:rPr>
-                <w:rFonts w:ascii="Consolas" w:eastAsia="Arial" w:hAnsi="Consolas" w:cs="Arial"/>
-              </w:rPr>
-              <w:t>VARCHAR(</w:t>
-            </w:r>
-            <w:proofErr w:type="gramEnd"/>
-            <w:r>
-              <w:rPr>
-                <w:rFonts w:ascii="Consolas" w:eastAsia="Arial" w:hAnsi="Consolas" w:cs="Arial"/>
-              </w:rPr>
-              <w:t>50) NOT NULL,</w:t>
-            </w:r>
-          </w:p>
-          <w:p>
-            <w:pPr>
-              <w:jc w:val="both"/>
-              <w:rPr>
-                <w:rFonts w:ascii="Consolas" w:eastAsia="Arial" w:hAnsi="Consolas" w:cs="Arial"/>
-              </w:rPr>
-            </w:pPr>
-            <w:r>
-              <w:rPr>
-                <w:rFonts w:ascii="Consolas" w:eastAsia="Arial" w:hAnsi="Consolas" w:cs="Arial"/>
-              </w:rPr>
-              <w:t>    </w:t>
-            </w:r>
-            <w:proofErr w:type="spellStart"/>
             <w:r>
               <w:rPr>
                 <w:rFonts w:ascii="Consolas" w:eastAsia="Arial" w:hAnsi="Consolas" w:cs="Arial"/>
               </w:rPr>
               <w:t>direccion</w:t>
             </w:r>
-            <w:proofErr w:type="spellEnd"/>
             <w:r>
               <w:rPr>
                 <w:rFonts w:ascii="Consolas" w:eastAsia="Arial" w:hAnsi="Consolas" w:cs="Arial"/>
               </w:rPr>
               <w:t xml:space="preserve"> </w:t>
             </w:r>
-            <w:proofErr w:type="gramStart"/>
             <w:r>
               <w:rPr>
                 <w:rFonts w:ascii="Consolas" w:eastAsia="Arial" w:hAnsi="Consolas" w:cs="Arial"/>
                 <w:highlight w:val="cyan"/>
               </w:rPr>
-              <w:t>VARCHAR(</w:t>
-            </w:r>
-            <w:proofErr w:type="gramEnd"/>
-            <w:r>
-              <w:rPr>
-                <w:rFonts w:ascii="Consolas" w:eastAsia="Arial" w:hAnsi="Consolas" w:cs="Arial"/>
-                <w:highlight w:val="cyan"/>
-              </w:rPr>
-              <w:t>100)</w:t>
+              <w:t>VARCHAR(100)</w:t>
             </w:r>
             <w:r>
               <w:rPr>
@@ -1606,21 +1402,7 @@
               <w:rPr>
                 <w:rFonts w:ascii="Consolas" w:eastAsia="Arial" w:hAnsi="Consolas" w:cs="Arial"/>
               </w:rPr>
-              <w:t xml:space="preserve">ciudad </w:t>
-            </w:r>
-            <w:proofErr w:type="gramStart"/>
-            <w:r>
-              <w:rPr>
-                <w:rFonts w:ascii="Consolas" w:eastAsia="Arial" w:hAnsi="Consolas" w:cs="Arial"/>
-              </w:rPr>
-              <w:t>VARCHAR(</w:t>
-            </w:r>
-            <w:proofErr w:type="gramEnd"/>
-            <w:r>
-              <w:rPr>
-                <w:rFonts w:ascii="Consolas" w:eastAsia="Arial" w:hAnsi="Consolas" w:cs="Arial"/>
-              </w:rPr>
-              <w:t>30) NOT NULL,</w:t>
+              <w:t>ciudad VARCHAR(30) NOT NULL,</w:t>
             </w:r>
           </w:p>
           <w:p>
@@ -1637,21 +1419,12 @@
               </w:rPr>
               <w:t xml:space="preserve">    </w:t>
             </w:r>
-            <w:proofErr w:type="spellStart"/>
             <w:r>
               <w:rPr>
                 <w:rFonts w:ascii="Consolas" w:eastAsia="Arial" w:hAnsi="Consolas" w:cs="Arial"/>
                 <w:lang w:val="en-US"/>
               </w:rPr>
-              <w:t>capacidad</w:t>
-            </w:r>
-            <w:proofErr w:type="spellEnd"/>
-            <w:r>
-              <w:rPr>
-                <w:rFonts w:ascii="Consolas" w:eastAsia="Arial" w:hAnsi="Consolas" w:cs="Arial"/>
-                <w:lang w:val="en-US"/>
-              </w:rPr>
-              <w:t xml:space="preserve"> INT NOT NULL</w:t>
+              <w:t>capacidad INT NOT NULL</w:t>
             </w:r>
           </w:p>
           <w:p>
@@ -1857,27 +1630,7 @@
                 <w:iCs/>
                 <w:color w:val="000000"/>
               </w:rPr>
-              <w:t>La entidad Eventos incorporará una clave foránea (</w:t>
-            </w:r>
-            <w:proofErr w:type="spellStart"/>
-            <w:r>
-              <w:rPr>
-                <w:rFonts w:ascii="Arial" w:eastAsia="Times New Roman" w:hAnsi="Arial" w:cs="Arial"/>
-                <w:i/>
-                <w:iCs/>
-                <w:color w:val="000000"/>
-              </w:rPr>
-              <w:t>id_ubicacion</w:t>
-            </w:r>
-            <w:proofErr w:type="spellEnd"/>
-            <w:r>
-              <w:rPr>
-                <w:rFonts w:ascii="Arial" w:eastAsia="Times New Roman" w:hAnsi="Arial" w:cs="Arial"/>
-                <w:i/>
-                <w:iCs/>
-                <w:color w:val="000000"/>
-              </w:rPr>
-              <w:t>) que vincula de manera directa cada evento con un recinto específico de la base de datos, permitiendo estructurar consultas complejas desde la interfaz orientadas a:</w:t>
+              <w:t>La entidad Eventos incorporará una clave foránea (id_ubicacion) que vincula de manera directa cada evento con un recinto específico de la base de datos, permitiendo estructurar consultas complejas desde la interfaz orientadas a:</w:t>
             </w:r>
           </w:p>
           <w:p>
@@ -2016,45 +1769,7 @@
               <w:rPr>
                 <w:rFonts w:ascii="Arial" w:eastAsia="Arial" w:hAnsi="Arial" w:cs="Arial"/>
               </w:rPr>
-              <w:t xml:space="preserve"> que comparte</w:t>
-            </w:r>
-            <w:r>
-              <w:rPr>
-                <w:rFonts w:ascii="Arial" w:eastAsia="Arial" w:hAnsi="Arial" w:cs="Arial"/>
-              </w:rPr>
-              <w:t>n las entidades de usuario y evento</w:t>
-            </w:r>
-            <w:r>
-              <w:rPr>
-                <w:rFonts w:ascii="Arial" w:eastAsia="Arial" w:hAnsi="Arial" w:cs="Arial"/>
-              </w:rPr>
-              <w:t xml:space="preserve"> </w:t>
-            </w:r>
-            <w:r>
-              <w:rPr>
-                <w:rFonts w:ascii="Arial" w:eastAsia="Arial" w:hAnsi="Arial" w:cs="Arial"/>
-              </w:rPr>
-              <w:t>es</w:t>
-            </w:r>
-            <w:r>
-              <w:rPr>
-                <w:rFonts w:ascii="Arial" w:eastAsia="Arial" w:hAnsi="Arial" w:cs="Arial"/>
-              </w:rPr>
-              <w:t xml:space="preserve"> UBICACIÓN-PERTENECE-EVENTO (</w:t>
-            </w:r>
-            <w:proofErr w:type="gramStart"/>
-            <w:r>
-              <w:rPr>
-                <w:rFonts w:ascii="Arial" w:eastAsia="Arial" w:hAnsi="Arial" w:cs="Arial"/>
-              </w:rPr>
-              <w:t>1:N</w:t>
-            </w:r>
-            <w:proofErr w:type="gramEnd"/>
-            <w:r>
-              <w:rPr>
-                <w:rFonts w:ascii="Arial" w:eastAsia="Arial" w:hAnsi="Arial" w:cs="Arial"/>
-              </w:rPr>
-              <w:t>), para permitir la asociación de un evento a la ubicación donde se realizará. En general, el fragmento de la entidad ubicación con sus atributos y relaciones se muestra así:</w:t>
+              <w:t xml:space="preserve"> que comparten las entidades de usuario y evento es UBICACIÓN-PERTENECE-EVENTO (1:N), para permitir la asociación de un evento a la ubicación donde se realizará. En general, el fragmento de la entidad ubicación con sus atributos y relaciones se muestra así:</w:t>
             </w:r>
           </w:p>
           <w:p>
@@ -2184,16 +1899,8 @@
               <w:rPr>
                 <w:rFonts w:ascii="Arial" w:eastAsia="Arial" w:hAnsi="Arial" w:cs="Arial"/>
               </w:rPr>
-              <w:t xml:space="preserve">Para el modelo lógico, se transforma el </w:t>
-            </w:r>
-            <w:proofErr w:type="spellStart"/>
-            <w:r>
-              <w:rPr>
-                <w:rFonts w:ascii="Arial" w:eastAsia="Arial" w:hAnsi="Arial" w:cs="Arial"/>
-              </w:rPr>
-              <w:t>id_ubicacion</w:t>
-            </w:r>
-            <w:proofErr w:type="spellEnd"/>
+              <w:t>Para el modelo lógico, se transforma el id_ubicacion</w:t>
+            </w:r>
             <w:r>
               <w:rPr>
                 <w:rFonts w:ascii="Arial" w:eastAsia="Arial" w:hAnsi="Arial" w:cs="Arial"/>
@@ -2256,83 +1963,13 @@
               <w:rPr>
                 <w:rFonts w:ascii="Consolas" w:eastAsia="Arial" w:hAnsi="Consolas" w:cs="Arial"/>
               </w:rPr>
-              <w:t>eventos(id_</w:t>
-            </w:r>
-            <w:proofErr w:type="gramStart"/>
-            <w:r>
-              <w:rPr>
-                <w:rFonts w:ascii="Consolas" w:eastAsia="Arial" w:hAnsi="Consolas" w:cs="Arial"/>
-              </w:rPr>
-              <w:t>evento[</w:t>
-            </w:r>
-            <w:proofErr w:type="gramEnd"/>
-            <w:r>
-              <w:rPr>
-                <w:rFonts w:ascii="Consolas" w:eastAsia="Arial" w:hAnsi="Consolas" w:cs="Arial"/>
-              </w:rPr>
-              <w:t>PK</w:t>
-            </w:r>
-            <w:proofErr w:type="gramStart"/>
-            <w:r>
-              <w:rPr>
-                <w:rFonts w:ascii="Consolas" w:eastAsia="Arial" w:hAnsi="Consolas" w:cs="Arial"/>
-              </w:rPr>
-              <w:t>],id</w:t>
-            </w:r>
-            <w:proofErr w:type="gramEnd"/>
-            <w:r>
-              <w:rPr>
-                <w:rFonts w:ascii="Consolas" w:eastAsia="Arial" w:hAnsi="Consolas" w:cs="Arial"/>
-              </w:rPr>
-              <w:t>_usuario_</w:t>
-            </w:r>
-            <w:proofErr w:type="gramStart"/>
-            <w:r>
-              <w:rPr>
-                <w:rFonts w:ascii="Consolas" w:eastAsia="Arial" w:hAnsi="Consolas" w:cs="Arial"/>
-              </w:rPr>
-              <w:t>propieta</w:t>
-            </w:r>
-            <w:r>
-              <w:rPr>
-                <w:rFonts w:ascii="Consolas" w:eastAsia="Arial" w:hAnsi="Consolas" w:cs="Arial"/>
-              </w:rPr>
-              <w:t>rio[</w:t>
-            </w:r>
-            <w:proofErr w:type="gramEnd"/>
-            <w:r>
-              <w:rPr>
-                <w:rFonts w:ascii="Consolas" w:eastAsia="Arial" w:hAnsi="Consolas" w:cs="Arial"/>
-              </w:rPr>
-              <w:t>FK</w:t>
-            </w:r>
-            <w:proofErr w:type="gramStart"/>
-            <w:r>
-              <w:rPr>
-                <w:rFonts w:ascii="Consolas" w:eastAsia="Arial" w:hAnsi="Consolas" w:cs="Arial"/>
-              </w:rPr>
-              <w:t>],id</w:t>
-            </w:r>
-            <w:proofErr w:type="gramEnd"/>
-            <w:r>
-              <w:rPr>
-                <w:rFonts w:ascii="Consolas" w:eastAsia="Arial" w:hAnsi="Consolas" w:cs="Arial"/>
-              </w:rPr>
-              <w:t>_</w:t>
-            </w:r>
-            <w:proofErr w:type="gramStart"/>
-            <w:r>
-              <w:rPr>
-                <w:rFonts w:ascii="Consolas" w:eastAsia="Arial" w:hAnsi="Consolas" w:cs="Arial"/>
-              </w:rPr>
-              <w:t>categoria,titulo</w:t>
-            </w:r>
-            <w:proofErr w:type="gramEnd"/>
-            <w:r>
-              <w:rPr>
-                <w:rFonts w:ascii="Consolas" w:eastAsia="Arial" w:hAnsi="Consolas" w:cs="Arial"/>
-              </w:rPr>
-              <w:t>,descripción,</w:t>
+              <w:t>eventos(id_evento[PK],id_usuario_propieta</w:t>
+            </w:r>
+            <w:r>
+              <w:rPr>
+                <w:rFonts w:ascii="Consolas" w:eastAsia="Arial" w:hAnsi="Consolas" w:cs="Arial"/>
+              </w:rPr>
+              <w:t>rio[FK],id_categoria,titulo,descripción,</w:t>
             </w:r>
           </w:p>
           <w:p>
@@ -2344,28 +1981,12 @@
                 <w:bCs/>
               </w:rPr>
             </w:pPr>
-            <w:proofErr w:type="spellStart"/>
-            <w:r>
-              <w:rPr>
-                <w:rFonts w:ascii="Consolas" w:eastAsia="Arial" w:hAnsi="Consolas" w:cs="Arial"/>
-              </w:rPr>
-              <w:t>fecha_</w:t>
-            </w:r>
-            <w:proofErr w:type="gramStart"/>
-            <w:r>
-              <w:rPr>
-                <w:rFonts w:ascii="Consolas" w:eastAsia="Arial" w:hAnsi="Consolas" w:cs="Arial"/>
-              </w:rPr>
-              <w:t>inicio,fecha</w:t>
-            </w:r>
-            <w:proofErr w:type="gramEnd"/>
-            <w:r>
-              <w:rPr>
-                <w:rFonts w:ascii="Consolas" w:eastAsia="Arial" w:hAnsi="Consolas" w:cs="Arial"/>
-              </w:rPr>
-              <w:t>_fin</w:t>
-            </w:r>
-            <w:proofErr w:type="spellEnd"/>
+            <w:r>
+              <w:rPr>
+                <w:rFonts w:ascii="Consolas" w:eastAsia="Arial" w:hAnsi="Consolas" w:cs="Arial"/>
+              </w:rPr>
+              <w:t>fecha_inicio,fecha_fin</w:t>
+            </w:r>
             <w:r>
               <w:rPr>
                 <w:rFonts w:ascii="Consolas" w:eastAsia="Arial" w:hAnsi="Consolas" w:cs="Arial"/>
@@ -2442,32 +2063,30 @@
               <w:rPr>
                 <w:rFonts w:ascii="Arial" w:eastAsia="Arial" w:hAnsi="Arial" w:cs="Arial"/>
               </w:rPr>
-              <w:t xml:space="preserve"> donde se especifica la inclusión del </w:t>
-            </w:r>
-            <w:proofErr w:type="spellStart"/>
-            <w:proofErr w:type="gramStart"/>
-            <w:r>
-              <w:rPr>
-                <w:rFonts w:ascii="Arial" w:eastAsia="Arial" w:hAnsi="Arial" w:cs="Arial"/>
-              </w:rPr>
-              <w:t>id:ubicación</w:t>
-            </w:r>
-            <w:proofErr w:type="spellEnd"/>
-            <w:proofErr w:type="gramEnd"/>
-            <w:r>
-              <w:rPr>
-                <w:rFonts w:ascii="Arial" w:eastAsia="Arial" w:hAnsi="Arial" w:cs="Arial"/>
-              </w:rPr>
-              <w:t xml:space="preserve"> como llave foránea a ese dato. Esto permitirá que la tabla guarde el dato que guarda la tabla usuarios. (se identifica en el modelo SQL con subrayado amarillo).</w:t>
-            </w:r>
-          </w:p>
-          <w:p>
-            <w:pPr>
-              <w:jc w:val="both"/>
-              <w:rPr>
-                <w:rFonts w:ascii="Arial" w:eastAsia="Arial" w:hAnsi="Arial" w:cs="Arial"/>
-              </w:rPr>
-            </w:pPr>
+              <w:t xml:space="preserve"> donde se especifica la inclusión del id:ubicación como llave foránea a ese dato. Esto permitirá que la tabla guarde el dato que guarda la tabla usuarios. (se identifica en el modelo SQL con subrayado amarillo).</w:t>
+            </w:r>
+          </w:p>
+          <w:p>
+            <w:pPr>
+              <w:jc w:val="both"/>
+              <w:rPr>
+                <w:rFonts w:ascii="Arial" w:eastAsia="Arial" w:hAnsi="Arial" w:cs="Arial"/>
+              </w:rPr>
+            </w:pPr>
+          </w:p>
+          <w:p>
+            <w:pPr>
+              <w:jc w:val="both"/>
+              <w:rPr>
+                <w:rFonts w:ascii="Consolas" w:eastAsia="Arial" w:hAnsi="Consolas" w:cs="Arial"/>
+              </w:rPr>
+            </w:pPr>
+            <w:r>
+              <w:rPr>
+                <w:rFonts w:ascii="Consolas" w:eastAsia="Arial" w:hAnsi="Consolas" w:cs="Arial"/>
+              </w:rPr>
+              <w:t>CREATE TABLE eventos (</w:t>
+            </w:r>
           </w:p>
           <w:p>
             <w:pPr>
@@ -2480,34 +2099,67 @@
             <w:r>
               <w:rPr>
                 <w:rFonts w:ascii="Consolas" w:eastAsia="Arial" w:hAnsi="Consolas" w:cs="Arial"/>
+              </w:rPr>
+              <w:t>    </w:t>
+            </w:r>
+            <w:r>
+              <w:rPr>
+                <w:rFonts w:ascii="Consolas" w:eastAsia="Arial" w:hAnsi="Consolas" w:cs="Arial"/>
                 <w:lang w:val="en-US"/>
               </w:rPr>
-              <w:t xml:space="preserve">CREATE TABLE </w:t>
-            </w:r>
-            <w:proofErr w:type="spellStart"/>
+              <w:t>id_evento SERIAL PRIMARY KEY,</w:t>
+            </w:r>
+          </w:p>
+          <w:p>
+            <w:pPr>
+              <w:jc w:val="both"/>
+              <w:rPr>
+                <w:rFonts w:ascii="Consolas" w:eastAsia="Arial" w:hAnsi="Consolas" w:cs="Arial"/>
+              </w:rPr>
+            </w:pPr>
             <w:r>
               <w:rPr>
                 <w:rFonts w:ascii="Consolas" w:eastAsia="Arial" w:hAnsi="Consolas" w:cs="Arial"/>
                 <w:lang w:val="en-US"/>
               </w:rPr>
-              <w:t>eventos</w:t>
-            </w:r>
-            <w:proofErr w:type="spellEnd"/>
-            <w:r>
+              <w:t>    </w:t>
+            </w:r>
+            <w:r>
+              <w:rPr>
+                <w:rFonts w:ascii="Consolas" w:eastAsia="Arial" w:hAnsi="Consolas" w:cs="Arial"/>
+                <w:highlight w:val="yellow"/>
+              </w:rPr>
+              <w:t>id_usuario_propietario INT NOT NULL REFERENCES usuarios(id_usuario),</w:t>
+            </w:r>
+          </w:p>
+          <w:p>
+            <w:pPr>
+              <w:jc w:val="both"/>
               <w:rPr>
                 <w:rFonts w:ascii="Consolas" w:eastAsia="Arial" w:hAnsi="Consolas" w:cs="Arial"/>
                 <w:lang w:val="en-US"/>
               </w:rPr>
-              <w:t xml:space="preserve"> (</w:t>
-            </w:r>
-          </w:p>
-          <w:p>
-            <w:pPr>
-              <w:jc w:val="both"/>
+            </w:pPr>
+            <w:r>
+              <w:rPr>
+                <w:rFonts w:ascii="Consolas" w:eastAsia="Arial" w:hAnsi="Consolas" w:cs="Arial"/>
+              </w:rPr>
+              <w:t>    </w:t>
+            </w:r>
+            <w:r>
               <w:rPr>
                 <w:rFonts w:ascii="Consolas" w:eastAsia="Arial" w:hAnsi="Consolas" w:cs="Arial"/>
                 <w:lang w:val="en-US"/>
               </w:rPr>
+              <w:t>id_categoria INT NOT NULL REFERENCES categorias(id_categoria),</w:t>
+            </w:r>
+          </w:p>
+          <w:p>
+            <w:pPr>
+              <w:jc w:val="both"/>
+              <w:rPr>
+                <w:rFonts w:ascii="Consolas" w:eastAsia="Arial" w:hAnsi="Consolas" w:cs="Arial"/>
+              </w:rPr>
             </w:pPr>
             <w:r>
               <w:rPr>
@@ -2516,314 +2168,67 @@
               </w:rPr>
               <w:t>    </w:t>
             </w:r>
-            <w:proofErr w:type="spellStart"/>
-            <w:r>
-              <w:rPr>
-                <w:rFonts w:ascii="Consolas" w:eastAsia="Arial" w:hAnsi="Consolas" w:cs="Arial"/>
-                <w:lang w:val="en-US"/>
-              </w:rPr>
-              <w:t>id_evento</w:t>
-            </w:r>
-            <w:proofErr w:type="spellEnd"/>
-            <w:r>
-              <w:rPr>
-                <w:rFonts w:ascii="Consolas" w:eastAsia="Arial" w:hAnsi="Consolas" w:cs="Arial"/>
-                <w:lang w:val="en-US"/>
-              </w:rPr>
-              <w:t xml:space="preserve"> SERIAL PRIMARY KEY,</w:t>
-            </w:r>
-          </w:p>
-          <w:p>
-            <w:pPr>
-              <w:jc w:val="both"/>
-              <w:rPr>
-                <w:rFonts w:ascii="Consolas" w:eastAsia="Arial" w:hAnsi="Consolas" w:cs="Arial"/>
-              </w:rPr>
-            </w:pPr>
-            <w:r>
-              <w:rPr>
-                <w:rFonts w:ascii="Consolas" w:eastAsia="Arial" w:hAnsi="Consolas" w:cs="Arial"/>
-                <w:lang w:val="en-US"/>
-              </w:rPr>
-              <w:t>    </w:t>
-            </w:r>
-            <w:proofErr w:type="spellStart"/>
-            <w:r>
-              <w:rPr>
-                <w:rFonts w:ascii="Consolas" w:eastAsia="Arial" w:hAnsi="Consolas" w:cs="Arial"/>
-                <w:highlight w:val="yellow"/>
-              </w:rPr>
-              <w:t>id_usuario_propietario</w:t>
-            </w:r>
-            <w:proofErr w:type="spellEnd"/>
-            <w:r>
-              <w:rPr>
-                <w:rFonts w:ascii="Consolas" w:eastAsia="Arial" w:hAnsi="Consolas" w:cs="Arial"/>
-                <w:highlight w:val="yellow"/>
-              </w:rPr>
-              <w:t xml:space="preserve"> INT NOT NULL REFERENCES usuarios(</w:t>
-            </w:r>
-            <w:proofErr w:type="spellStart"/>
-            <w:r>
-              <w:rPr>
-                <w:rFonts w:ascii="Consolas" w:eastAsia="Arial" w:hAnsi="Consolas" w:cs="Arial"/>
-                <w:highlight w:val="yellow"/>
-              </w:rPr>
-              <w:t>id_usuario</w:t>
-            </w:r>
-            <w:proofErr w:type="spellEnd"/>
-            <w:r>
-              <w:rPr>
-                <w:rFonts w:ascii="Consolas" w:eastAsia="Arial" w:hAnsi="Consolas" w:cs="Arial"/>
-                <w:highlight w:val="yellow"/>
-              </w:rPr>
-              <w:t>),</w:t>
-            </w:r>
-          </w:p>
-          <w:p>
-            <w:pPr>
-              <w:jc w:val="both"/>
-              <w:rPr>
-                <w:rFonts w:ascii="Consolas" w:eastAsia="Arial" w:hAnsi="Consolas" w:cs="Arial"/>
-                <w:lang w:val="en-US"/>
-              </w:rPr>
-            </w:pPr>
-            <w:r>
-              <w:rPr>
-                <w:rFonts w:ascii="Consolas" w:eastAsia="Arial" w:hAnsi="Consolas" w:cs="Arial"/>
-              </w:rPr>
-              <w:t>    </w:t>
-            </w:r>
-            <w:proofErr w:type="spellStart"/>
-            <w:r>
-              <w:rPr>
-                <w:rFonts w:ascii="Consolas" w:eastAsia="Arial" w:hAnsi="Consolas" w:cs="Arial"/>
-                <w:lang w:val="en-US"/>
-              </w:rPr>
-              <w:t>id_categoria</w:t>
-            </w:r>
-            <w:proofErr w:type="spellEnd"/>
-            <w:r>
-              <w:rPr>
-                <w:rFonts w:ascii="Consolas" w:eastAsia="Arial" w:hAnsi="Consolas" w:cs="Arial"/>
-                <w:lang w:val="en-US"/>
-              </w:rPr>
-              <w:t xml:space="preserve"> INT NOT NULL REFERENCES </w:t>
-            </w:r>
-            <w:proofErr w:type="spellStart"/>
-            <w:r>
-              <w:rPr>
-                <w:rFonts w:ascii="Consolas" w:eastAsia="Arial" w:hAnsi="Consolas" w:cs="Arial"/>
-                <w:lang w:val="en-US"/>
-              </w:rPr>
-              <w:t>categorias</w:t>
-            </w:r>
-            <w:proofErr w:type="spellEnd"/>
-            <w:r>
-              <w:rPr>
-                <w:rFonts w:ascii="Consolas" w:eastAsia="Arial" w:hAnsi="Consolas" w:cs="Arial"/>
-                <w:lang w:val="en-US"/>
-              </w:rPr>
-              <w:t>(</w:t>
-            </w:r>
-            <w:proofErr w:type="spellStart"/>
-            <w:r>
-              <w:rPr>
-                <w:rFonts w:ascii="Consolas" w:eastAsia="Arial" w:hAnsi="Consolas" w:cs="Arial"/>
-                <w:lang w:val="en-US"/>
-              </w:rPr>
-              <w:t>id_categoria</w:t>
-            </w:r>
-            <w:proofErr w:type="spellEnd"/>
-            <w:r>
-              <w:rPr>
-                <w:rFonts w:ascii="Consolas" w:eastAsia="Arial" w:hAnsi="Consolas" w:cs="Arial"/>
-                <w:lang w:val="en-US"/>
-              </w:rPr>
-              <w:t>),</w:t>
-            </w:r>
-          </w:p>
-          <w:p>
-            <w:pPr>
-              <w:jc w:val="both"/>
-              <w:rPr>
-                <w:rFonts w:ascii="Consolas" w:eastAsia="Arial" w:hAnsi="Consolas" w:cs="Arial"/>
-              </w:rPr>
-            </w:pPr>
-            <w:r>
-              <w:rPr>
-                <w:rFonts w:ascii="Consolas" w:eastAsia="Arial" w:hAnsi="Consolas" w:cs="Arial"/>
-                <w:lang w:val="en-US"/>
-              </w:rPr>
-              <w:t>    </w:t>
-            </w:r>
-            <w:proofErr w:type="spellStart"/>
-            <w:r>
-              <w:rPr>
-                <w:rFonts w:ascii="Consolas" w:eastAsia="Arial" w:hAnsi="Consolas" w:cs="Arial"/>
-              </w:rPr>
-              <w:t>titulo</w:t>
-            </w:r>
-            <w:proofErr w:type="spellEnd"/>
-            <w:r>
-              <w:rPr>
-                <w:rFonts w:ascii="Consolas" w:eastAsia="Arial" w:hAnsi="Consolas" w:cs="Arial"/>
-              </w:rPr>
-              <w:t xml:space="preserve"> </w:t>
-            </w:r>
-            <w:proofErr w:type="gramStart"/>
-            <w:r>
-              <w:rPr>
-                <w:rFonts w:ascii="Consolas" w:eastAsia="Arial" w:hAnsi="Consolas" w:cs="Arial"/>
-              </w:rPr>
-              <w:t>VARCHAR(</w:t>
-            </w:r>
-            <w:proofErr w:type="gramEnd"/>
-            <w:r>
-              <w:rPr>
-                <w:rFonts w:ascii="Consolas" w:eastAsia="Arial" w:hAnsi="Consolas" w:cs="Arial"/>
-              </w:rPr>
-              <w:t>100) NOT NULL,</w:t>
-            </w:r>
-          </w:p>
-          <w:p>
-            <w:pPr>
-              <w:jc w:val="both"/>
-              <w:rPr>
-                <w:rFonts w:ascii="Consolas" w:eastAsia="Arial" w:hAnsi="Consolas" w:cs="Arial"/>
-              </w:rPr>
-            </w:pPr>
-            <w:r>
-              <w:rPr>
-                <w:rFonts w:ascii="Consolas" w:eastAsia="Arial" w:hAnsi="Consolas" w:cs="Arial"/>
-              </w:rPr>
-              <w:t>    </w:t>
-            </w:r>
-            <w:proofErr w:type="spellStart"/>
-            <w:r>
-              <w:rPr>
-                <w:rFonts w:ascii="Consolas" w:eastAsia="Arial" w:hAnsi="Consolas" w:cs="Arial"/>
-              </w:rPr>
-              <w:t>descripcion</w:t>
-            </w:r>
-            <w:proofErr w:type="spellEnd"/>
-            <w:r>
-              <w:rPr>
-                <w:rFonts w:ascii="Consolas" w:eastAsia="Arial" w:hAnsi="Consolas" w:cs="Arial"/>
-              </w:rPr>
-              <w:t xml:space="preserve"> TEXT,</w:t>
-            </w:r>
-          </w:p>
-          <w:p>
-            <w:pPr>
-              <w:jc w:val="both"/>
-              <w:rPr>
-                <w:rFonts w:ascii="Consolas" w:eastAsia="Arial" w:hAnsi="Consolas" w:cs="Arial"/>
-              </w:rPr>
-            </w:pPr>
-            <w:r>
-              <w:rPr>
-                <w:rFonts w:ascii="Consolas" w:eastAsia="Arial" w:hAnsi="Consolas" w:cs="Arial"/>
-              </w:rPr>
-              <w:t>    </w:t>
-            </w:r>
-            <w:proofErr w:type="spellStart"/>
-            <w:r>
-              <w:rPr>
-                <w:rFonts w:ascii="Consolas" w:eastAsia="Arial" w:hAnsi="Consolas" w:cs="Arial"/>
-              </w:rPr>
-              <w:t>fecha_inicio</w:t>
-            </w:r>
-            <w:proofErr w:type="spellEnd"/>
-            <w:r>
-              <w:rPr>
-                <w:rFonts w:ascii="Consolas" w:eastAsia="Arial" w:hAnsi="Consolas" w:cs="Arial"/>
-              </w:rPr>
-              <w:t xml:space="preserve"> TIMESTAMP NOT NULL,</w:t>
-            </w:r>
-          </w:p>
-          <w:p>
-            <w:pPr>
-              <w:jc w:val="both"/>
-              <w:rPr>
-                <w:rFonts w:ascii="Consolas" w:eastAsia="Arial" w:hAnsi="Consolas" w:cs="Arial"/>
-              </w:rPr>
-            </w:pPr>
-            <w:r>
-              <w:rPr>
-                <w:rFonts w:ascii="Consolas" w:eastAsia="Arial" w:hAnsi="Consolas" w:cs="Arial"/>
-              </w:rPr>
-              <w:t>    </w:t>
-            </w:r>
-            <w:proofErr w:type="spellStart"/>
-            <w:r>
-              <w:rPr>
-                <w:rFonts w:ascii="Consolas" w:eastAsia="Arial" w:hAnsi="Consolas" w:cs="Arial"/>
-              </w:rPr>
-              <w:t>fecha_fin</w:t>
-            </w:r>
-            <w:proofErr w:type="spellEnd"/>
-            <w:r>
-              <w:rPr>
-                <w:rFonts w:ascii="Consolas" w:eastAsia="Arial" w:hAnsi="Consolas" w:cs="Arial"/>
-              </w:rPr>
-              <w:t xml:space="preserve"> TIMESTAMP NOT NULL,</w:t>
-            </w:r>
-          </w:p>
-          <w:p>
-            <w:pPr>
-              <w:jc w:val="both"/>
-              <w:rPr>
-                <w:rFonts w:ascii="Consolas" w:eastAsia="Arial" w:hAnsi="Consolas" w:cs="Arial"/>
-              </w:rPr>
-            </w:pPr>
-            <w:r>
-              <w:rPr>
-                <w:rFonts w:ascii="Consolas" w:eastAsia="Arial" w:hAnsi="Consolas" w:cs="Arial"/>
-              </w:rPr>
-              <w:t xml:space="preserve">    CONSTRAINT </w:t>
-            </w:r>
-            <w:proofErr w:type="spellStart"/>
-            <w:r>
-              <w:rPr>
-                <w:rFonts w:ascii="Consolas" w:eastAsia="Arial" w:hAnsi="Consolas" w:cs="Arial"/>
-              </w:rPr>
-              <w:t>check_fechas</w:t>
-            </w:r>
-            <w:proofErr w:type="spellEnd"/>
-            <w:r>
-              <w:rPr>
-                <w:rFonts w:ascii="Consolas" w:eastAsia="Arial" w:hAnsi="Consolas" w:cs="Arial"/>
-              </w:rPr>
-              <w:t xml:space="preserve"> CHECK (</w:t>
-            </w:r>
-            <w:proofErr w:type="spellStart"/>
-            <w:r>
-              <w:rPr>
-                <w:rFonts w:ascii="Consolas" w:eastAsia="Arial" w:hAnsi="Consolas" w:cs="Arial"/>
-              </w:rPr>
-              <w:t>fecha_fin</w:t>
-            </w:r>
-            <w:proofErr w:type="spellEnd"/>
-            <w:r>
-              <w:rPr>
-                <w:rFonts w:ascii="Consolas" w:eastAsia="Arial" w:hAnsi="Consolas" w:cs="Arial"/>
-              </w:rPr>
-              <w:t xml:space="preserve"> &gt; </w:t>
-            </w:r>
-            <w:proofErr w:type="spellStart"/>
-            <w:r>
-              <w:rPr>
-                <w:rFonts w:ascii="Consolas" w:eastAsia="Arial" w:hAnsi="Consolas" w:cs="Arial"/>
-              </w:rPr>
-              <w:t>fecha_inicio</w:t>
-            </w:r>
-            <w:proofErr w:type="spellEnd"/>
-            <w:r>
-              <w:rPr>
-                <w:rFonts w:ascii="Consolas" w:eastAsia="Arial" w:hAnsi="Consolas" w:cs="Arial"/>
-              </w:rPr>
-              <w:t>)</w:t>
+            <w:r>
+              <w:rPr>
+                <w:rFonts w:ascii="Consolas" w:eastAsia="Arial" w:hAnsi="Consolas" w:cs="Arial"/>
+              </w:rPr>
+              <w:t>titulo VARCHAR(100) NOT NULL,</w:t>
+            </w:r>
+          </w:p>
+          <w:p>
+            <w:pPr>
+              <w:jc w:val="both"/>
+              <w:rPr>
+                <w:rFonts w:ascii="Consolas" w:eastAsia="Arial" w:hAnsi="Consolas" w:cs="Arial"/>
+              </w:rPr>
+            </w:pPr>
+            <w:r>
+              <w:rPr>
+                <w:rFonts w:ascii="Consolas" w:eastAsia="Arial" w:hAnsi="Consolas" w:cs="Arial"/>
+              </w:rPr>
+              <w:t>    descripcion TEXT,</w:t>
+            </w:r>
+          </w:p>
+          <w:p>
+            <w:pPr>
+              <w:jc w:val="both"/>
+              <w:rPr>
+                <w:rFonts w:ascii="Consolas" w:eastAsia="Arial" w:hAnsi="Consolas" w:cs="Arial"/>
+              </w:rPr>
+            </w:pPr>
+            <w:r>
+              <w:rPr>
+                <w:rFonts w:ascii="Consolas" w:eastAsia="Arial" w:hAnsi="Consolas" w:cs="Arial"/>
+              </w:rPr>
+              <w:t>    fecha_inicio TIMESTAMP NOT NULL,</w:t>
+            </w:r>
+          </w:p>
+          <w:p>
+            <w:pPr>
+              <w:jc w:val="both"/>
+              <w:rPr>
+                <w:rFonts w:ascii="Consolas" w:eastAsia="Arial" w:hAnsi="Consolas" w:cs="Arial"/>
+              </w:rPr>
+            </w:pPr>
+            <w:r>
+              <w:rPr>
+                <w:rFonts w:ascii="Consolas" w:eastAsia="Arial" w:hAnsi="Consolas" w:cs="Arial"/>
+              </w:rPr>
+              <w:t>    fecha_fin TIMESTAMP NOT NULL,</w:t>
+            </w:r>
+          </w:p>
+          <w:p>
+            <w:pPr>
+              <w:jc w:val="both"/>
+              <w:rPr>
+                <w:rFonts w:ascii="Consolas" w:eastAsia="Arial" w:hAnsi="Consolas" w:cs="Arial"/>
+              </w:rPr>
+            </w:pPr>
+            <w:r>
+              <w:rPr>
+                <w:rFonts w:ascii="Consolas" w:eastAsia="Arial" w:hAnsi="Consolas" w:cs="Arial"/>
+              </w:rPr>
+              <w:t>    CONSTRAINT check_fechas CHECK (fecha_fin &gt; fecha_inicio)</w:t>
             </w:r>
           </w:p>
           <w:p>
@@ -3032,27 +2437,7 @@
                 <w:iCs/>
                 <w:color w:val="000000"/>
               </w:rPr>
-              <w:t>La entidad Eventos incorporará una clave foránea (</w:t>
-            </w:r>
-            <w:proofErr w:type="spellStart"/>
-            <w:r>
-              <w:rPr>
-                <w:rFonts w:ascii="Arial" w:eastAsia="Times New Roman" w:hAnsi="Arial" w:cs="Arial"/>
-                <w:i/>
-                <w:iCs/>
-                <w:color w:val="000000"/>
-              </w:rPr>
-              <w:t>id_ubicacion</w:t>
-            </w:r>
-            <w:proofErr w:type="spellEnd"/>
-            <w:r>
-              <w:rPr>
-                <w:rFonts w:ascii="Arial" w:eastAsia="Times New Roman" w:hAnsi="Arial" w:cs="Arial"/>
-                <w:i/>
-                <w:iCs/>
-                <w:color w:val="000000"/>
-              </w:rPr>
-              <w:t>) que vincula de manera directa cada evento con un recinto específico de la base de datos, permitiendo estructurar consultas complejas desde la interfaz orientadas a:</w:t>
+              <w:t>La entidad Eventos incorporará una clave foránea (id_ubicacion) que vincula de manera directa cada evento con un recinto específico de la base de datos, permitiendo estructurar consultas complejas desde la interfaz orientadas a:</w:t>
             </w:r>
           </w:p>
           <w:p>
@@ -3210,443 +2595,223 @@
               <w:rPr>
                 <w:rFonts w:ascii="Arial" w:eastAsia="Arial" w:hAnsi="Arial" w:cs="Arial"/>
               </w:rPr>
-              <w:t xml:space="preserve"> para apuntar al id de la tabla de ubicaciones. </w:t>
-            </w:r>
-            <w:r>
-              <w:rPr>
-                <w:rFonts w:ascii="Arial" w:eastAsia="Arial" w:hAnsi="Arial" w:cs="Arial"/>
-              </w:rPr>
-              <w:t>(se identifica en el modelo SQL con subrayado amarillo).</w:t>
-            </w:r>
-            <w:r>
-              <w:rPr>
-                <w:rFonts w:ascii="Arial" w:eastAsia="Arial" w:hAnsi="Arial" w:cs="Arial"/>
+              <w:t xml:space="preserve"> para apuntar al id de la tabla de ubicaciones. (se identifica en el modelo SQL con subrayado amarillo). </w:t>
+            </w:r>
+          </w:p>
+          <w:p>
+            <w:pPr>
+              <w:ind w:right="37"/>
+              <w:jc w:val="both"/>
+              <w:rPr>
+                <w:rFonts w:ascii="Arial" w:eastAsia="Arial" w:hAnsi="Arial" w:cs="Arial"/>
+              </w:rPr>
+            </w:pPr>
+          </w:p>
+          <w:p>
+            <w:pPr>
+              <w:ind w:right="37"/>
+              <w:jc w:val="both"/>
+              <w:rPr>
+                <w:rFonts w:ascii="Consolas" w:eastAsia="Arial" w:hAnsi="Consolas" w:cs="Arial"/>
+              </w:rPr>
+            </w:pPr>
+            <w:r>
+              <w:rPr>
+                <w:rFonts w:ascii="Consolas" w:eastAsia="Arial" w:hAnsi="Consolas" w:cs="Arial"/>
+              </w:rPr>
+              <w:t>CREATE TABLE eventos (</w:t>
+            </w:r>
+          </w:p>
+          <w:p>
+            <w:pPr>
+              <w:ind w:right="37"/>
+              <w:jc w:val="both"/>
+              <w:rPr>
+                <w:rFonts w:ascii="Consolas" w:eastAsia="Arial" w:hAnsi="Consolas" w:cs="Arial"/>
+                <w:lang w:val="en-US"/>
+              </w:rPr>
+            </w:pPr>
+            <w:r>
+              <w:rPr>
+                <w:rFonts w:ascii="Consolas" w:eastAsia="Arial" w:hAnsi="Consolas" w:cs="Arial"/>
+              </w:rPr>
+              <w:t>    </w:t>
+            </w:r>
+            <w:r>
+              <w:rPr>
+                <w:rFonts w:ascii="Consolas" w:eastAsia="Arial" w:hAnsi="Consolas" w:cs="Arial"/>
+                <w:lang w:val="en-US"/>
+              </w:rPr>
+              <w:t>id_evento SERIAL PRIMARY KEY,</w:t>
+            </w:r>
+          </w:p>
+          <w:p>
+            <w:pPr>
+              <w:ind w:right="37"/>
+              <w:jc w:val="both"/>
+              <w:rPr>
+                <w:rFonts w:ascii="Consolas" w:eastAsia="Arial" w:hAnsi="Consolas" w:cs="Arial"/>
+              </w:rPr>
+            </w:pPr>
+            <w:r>
+              <w:rPr>
+                <w:rFonts w:ascii="Consolas" w:eastAsia="Arial" w:hAnsi="Consolas" w:cs="Arial"/>
+                <w:lang w:val="en-US"/>
+              </w:rPr>
+              <w:t>    </w:t>
+            </w:r>
+            <w:r>
+              <w:rPr>
+                <w:rFonts w:ascii="Consolas" w:eastAsia="Arial" w:hAnsi="Consolas" w:cs="Arial"/>
+              </w:rPr>
+              <w:t>id_usuario_propietario INT NOT NULL REFERENCES usuarios(id_usuario),</w:t>
+            </w:r>
+          </w:p>
+          <w:p>
+            <w:pPr>
+              <w:ind w:right="37"/>
+              <w:jc w:val="both"/>
+              <w:rPr>
+                <w:rFonts w:ascii="Consolas" w:eastAsia="Arial" w:hAnsi="Consolas" w:cs="Arial"/>
+                <w:lang w:val="en-US"/>
+              </w:rPr>
+            </w:pPr>
+            <w:r>
+              <w:rPr>
+                <w:rFonts w:ascii="Consolas" w:eastAsia="Arial" w:hAnsi="Consolas" w:cs="Arial"/>
+              </w:rPr>
+              <w:t>    </w:t>
+            </w:r>
+            <w:r>
+              <w:rPr>
+                <w:rFonts w:ascii="Consolas" w:eastAsia="Arial" w:hAnsi="Consolas" w:cs="Arial"/>
+                <w:lang w:val="en-US"/>
+              </w:rPr>
+              <w:t>id_categoria INT NOT NULL REFERENCES categorias(id_categoria),</w:t>
+            </w:r>
+          </w:p>
+          <w:p>
+            <w:pPr>
+              <w:ind w:right="37"/>
+              <w:jc w:val="both"/>
+              <w:rPr>
+                <w:rFonts w:ascii="Consolas" w:eastAsia="Arial" w:hAnsi="Consolas" w:cs="Arial"/>
+              </w:rPr>
+            </w:pPr>
+            <w:r>
+              <w:rPr>
+                <w:rFonts w:ascii="Consolas" w:eastAsia="Arial" w:hAnsi="Consolas" w:cs="Arial"/>
+                <w:lang w:val="en-US"/>
+              </w:rPr>
+              <w:t>    </w:t>
+            </w:r>
+            <w:r>
+              <w:rPr>
+                <w:rFonts w:ascii="Consolas" w:eastAsia="Arial" w:hAnsi="Consolas" w:cs="Arial"/>
+              </w:rPr>
+              <w:t>titulo VARCHAR(100) NOT NULL,</w:t>
+            </w:r>
+          </w:p>
+          <w:p>
+            <w:pPr>
+              <w:ind w:right="37"/>
+              <w:jc w:val="both"/>
+              <w:rPr>
+                <w:rFonts w:ascii="Consolas" w:eastAsia="Arial" w:hAnsi="Consolas" w:cs="Arial"/>
+              </w:rPr>
+            </w:pPr>
+            <w:r>
+              <w:rPr>
+                <w:rFonts w:ascii="Consolas" w:eastAsia="Arial" w:hAnsi="Consolas" w:cs="Arial"/>
+              </w:rPr>
+              <w:t>    descripcion TEXT,</w:t>
+            </w:r>
+          </w:p>
+          <w:p>
+            <w:pPr>
+              <w:ind w:right="37"/>
+              <w:jc w:val="both"/>
+              <w:rPr>
+                <w:rFonts w:ascii="Consolas" w:eastAsia="Arial" w:hAnsi="Consolas" w:cs="Arial"/>
+              </w:rPr>
+            </w:pPr>
+            <w:r>
+              <w:rPr>
+                <w:rFonts w:ascii="Consolas" w:eastAsia="Arial" w:hAnsi="Consolas" w:cs="Arial"/>
+              </w:rPr>
+              <w:t>    fecha_inicio TIMESTAMP NOT NULL,</w:t>
+            </w:r>
+          </w:p>
+          <w:p>
+            <w:pPr>
+              <w:ind w:right="37"/>
+              <w:jc w:val="both"/>
+              <w:rPr>
+                <w:rFonts w:ascii="Consolas" w:eastAsia="Arial" w:hAnsi="Consolas" w:cs="Arial"/>
+              </w:rPr>
+            </w:pPr>
+            <w:r>
+              <w:rPr>
+                <w:rFonts w:ascii="Consolas" w:eastAsia="Arial" w:hAnsi="Consolas" w:cs="Arial"/>
+              </w:rPr>
+              <w:t>    fecha_fin TIMESTAMP NOT NULL,</w:t>
+            </w:r>
+          </w:p>
+          <w:p>
+            <w:pPr>
+              <w:ind w:right="37"/>
+              <w:jc w:val="both"/>
+              <w:rPr>
+                <w:rFonts w:ascii="Consolas" w:eastAsia="Arial" w:hAnsi="Consolas" w:cs="Arial"/>
+              </w:rPr>
+            </w:pPr>
+            <w:r>
+              <w:rPr>
+                <w:rFonts w:ascii="Consolas" w:eastAsia="Arial" w:hAnsi="Consolas" w:cs="Arial"/>
+              </w:rPr>
+              <w:t>    CONSTRAINT check_fechas CHECK (fecha_fin &gt; fecha_inicio)</w:t>
+            </w:r>
+            <w:r>
+              <w:rPr>
+                <w:rFonts w:ascii="Consolas" w:eastAsia="Arial" w:hAnsi="Consolas" w:cs="Arial"/>
+              </w:rPr>
+              <w:t>,</w:t>
+            </w:r>
+          </w:p>
+          <w:p>
+            <w:pPr>
+              <w:ind w:right="37"/>
+              <w:jc w:val="both"/>
+              <w:rPr>
+                <w:rFonts w:ascii="Consolas" w:eastAsia="Arial" w:hAnsi="Consolas" w:cs="Arial"/>
+              </w:rPr>
+            </w:pPr>
+            <w:r>
+              <w:rPr>
+                <w:rFonts w:ascii="Consolas" w:eastAsia="Arial" w:hAnsi="Consolas" w:cs="Arial"/>
+              </w:rPr>
+              <w:t xml:space="preserve">    </w:t>
+            </w:r>
+            <w:r>
+              <w:rPr>
+                <w:rFonts w:ascii="Consolas" w:eastAsia="Arial" w:hAnsi="Consolas" w:cs="Arial"/>
+                <w:highlight w:val="yellow"/>
+              </w:rPr>
+              <w:t>id_ubicacion</w:t>
+            </w:r>
+            <w:r>
+              <w:rPr>
+                <w:rFonts w:ascii="Consolas" w:eastAsia="Arial" w:hAnsi="Consolas" w:cs="Arial"/>
+                <w:highlight w:val="yellow"/>
               </w:rPr>
               <w:t xml:space="preserve"> </w:t>
             </w:r>
-          </w:p>
-          <w:p>
-            <w:pPr>
-              <w:ind w:right="37"/>
-              <w:jc w:val="both"/>
-              <w:rPr>
-                <w:rFonts w:ascii="Arial" w:eastAsia="Arial" w:hAnsi="Arial" w:cs="Arial"/>
-              </w:rPr>
-            </w:pPr>
-          </w:p>
-          <w:p>
-            <w:pPr>
-              <w:ind w:right="37"/>
-              <w:jc w:val="both"/>
-              <w:rPr>
-                <w:rFonts w:ascii="Consolas" w:eastAsia="Arial" w:hAnsi="Consolas" w:cs="Arial"/>
-                <w:lang w:val="en-US"/>
-              </w:rPr>
-            </w:pPr>
-            <w:r>
-              <w:rPr>
-                <w:rFonts w:ascii="Consolas" w:eastAsia="Arial" w:hAnsi="Consolas" w:cs="Arial"/>
-                <w:lang w:val="en-US"/>
-              </w:rPr>
-              <w:t xml:space="preserve">CREATE TABLE </w:t>
-            </w:r>
-            <w:proofErr w:type="spellStart"/>
-            <w:r>
-              <w:rPr>
-                <w:rFonts w:ascii="Consolas" w:eastAsia="Arial" w:hAnsi="Consolas" w:cs="Arial"/>
-                <w:lang w:val="en-US"/>
-              </w:rPr>
-              <w:t>eventos</w:t>
-            </w:r>
-            <w:proofErr w:type="spellEnd"/>
-            <w:r>
-              <w:rPr>
-                <w:rFonts w:ascii="Consolas" w:eastAsia="Arial" w:hAnsi="Consolas" w:cs="Arial"/>
-                <w:lang w:val="en-US"/>
-              </w:rPr>
-              <w:t xml:space="preserve"> (</w:t>
-            </w:r>
-          </w:p>
-          <w:p>
-            <w:pPr>
-              <w:ind w:right="37"/>
-              <w:jc w:val="both"/>
-              <w:rPr>
-                <w:rFonts w:ascii="Consolas" w:eastAsia="Arial" w:hAnsi="Consolas" w:cs="Arial"/>
-                <w:lang w:val="en-US"/>
-              </w:rPr>
-            </w:pPr>
-            <w:r>
-              <w:rPr>
-                <w:rFonts w:ascii="Consolas" w:eastAsia="Arial" w:hAnsi="Consolas" w:cs="Arial"/>
-                <w:lang w:val="en-US"/>
-              </w:rPr>
-              <w:t>    </w:t>
-            </w:r>
-            <w:proofErr w:type="spellStart"/>
-            <w:r>
-              <w:rPr>
-                <w:rFonts w:ascii="Consolas" w:eastAsia="Arial" w:hAnsi="Consolas" w:cs="Arial"/>
-                <w:lang w:val="en-US"/>
-              </w:rPr>
-              <w:t>id_evento</w:t>
-            </w:r>
-            <w:proofErr w:type="spellEnd"/>
-            <w:r>
-              <w:rPr>
-                <w:rFonts w:ascii="Consolas" w:eastAsia="Arial" w:hAnsi="Consolas" w:cs="Arial"/>
-                <w:lang w:val="en-US"/>
-              </w:rPr>
-              <w:t xml:space="preserve"> SERIAL PRIMARY KEY,</w:t>
-            </w:r>
-          </w:p>
-          <w:p>
-            <w:pPr>
-              <w:ind w:right="37"/>
-              <w:jc w:val="both"/>
-              <w:rPr>
-                <w:rFonts w:ascii="Consolas" w:eastAsia="Arial" w:hAnsi="Consolas" w:cs="Arial"/>
-              </w:rPr>
-            </w:pPr>
-            <w:r>
-              <w:rPr>
-                <w:rFonts w:ascii="Consolas" w:eastAsia="Arial" w:hAnsi="Consolas" w:cs="Arial"/>
-                <w:lang w:val="en-US"/>
-              </w:rPr>
-              <w:t>    </w:t>
-            </w:r>
-            <w:proofErr w:type="spellStart"/>
-            <w:r>
-              <w:rPr>
-                <w:rFonts w:ascii="Consolas" w:eastAsia="Arial" w:hAnsi="Consolas" w:cs="Arial"/>
-              </w:rPr>
-              <w:t>id_usuario_propietario</w:t>
-            </w:r>
-            <w:proofErr w:type="spellEnd"/>
-            <w:r>
-              <w:rPr>
-                <w:rFonts w:ascii="Consolas" w:eastAsia="Arial" w:hAnsi="Consolas" w:cs="Arial"/>
-              </w:rPr>
-              <w:t xml:space="preserve"> INT NOT NULL REFERENCES usuarios(</w:t>
-            </w:r>
-            <w:proofErr w:type="spellStart"/>
-            <w:r>
-              <w:rPr>
-                <w:rFonts w:ascii="Consolas" w:eastAsia="Arial" w:hAnsi="Consolas" w:cs="Arial"/>
-              </w:rPr>
-              <w:t>id_usuario</w:t>
-            </w:r>
-            <w:proofErr w:type="spellEnd"/>
-            <w:r>
-              <w:rPr>
-                <w:rFonts w:ascii="Consolas" w:eastAsia="Arial" w:hAnsi="Consolas" w:cs="Arial"/>
-              </w:rPr>
-              <w:t>),</w:t>
-            </w:r>
-          </w:p>
-          <w:p>
-            <w:pPr>
-              <w:ind w:right="37"/>
-              <w:jc w:val="both"/>
-              <w:rPr>
-                <w:rFonts w:ascii="Consolas" w:eastAsia="Arial" w:hAnsi="Consolas" w:cs="Arial"/>
-                <w:lang w:val="en-US"/>
-              </w:rPr>
-            </w:pPr>
-            <w:r>
-              <w:rPr>
-                <w:rFonts w:ascii="Consolas" w:eastAsia="Arial" w:hAnsi="Consolas" w:cs="Arial"/>
-              </w:rPr>
-              <w:t>    </w:t>
-            </w:r>
-            <w:proofErr w:type="spellStart"/>
-            <w:r>
-              <w:rPr>
-                <w:rFonts w:ascii="Consolas" w:eastAsia="Arial" w:hAnsi="Consolas" w:cs="Arial"/>
-                <w:lang w:val="en-US"/>
-              </w:rPr>
-              <w:t>id_categoria</w:t>
-            </w:r>
-            <w:proofErr w:type="spellEnd"/>
-            <w:r>
-              <w:rPr>
-                <w:rFonts w:ascii="Consolas" w:eastAsia="Arial" w:hAnsi="Consolas" w:cs="Arial"/>
-                <w:lang w:val="en-US"/>
-              </w:rPr>
-              <w:t xml:space="preserve"> INT NOT NULL REFERENCES </w:t>
-            </w:r>
-            <w:proofErr w:type="spellStart"/>
-            <w:r>
-              <w:rPr>
-                <w:rFonts w:ascii="Consolas" w:eastAsia="Arial" w:hAnsi="Consolas" w:cs="Arial"/>
-                <w:lang w:val="en-US"/>
-              </w:rPr>
-              <w:t>categorias</w:t>
-            </w:r>
-            <w:proofErr w:type="spellEnd"/>
-            <w:r>
-              <w:rPr>
-                <w:rFonts w:ascii="Consolas" w:eastAsia="Arial" w:hAnsi="Consolas" w:cs="Arial"/>
-                <w:lang w:val="en-US"/>
-              </w:rPr>
-              <w:t>(</w:t>
-            </w:r>
-            <w:proofErr w:type="spellStart"/>
-            <w:r>
-              <w:rPr>
-                <w:rFonts w:ascii="Consolas" w:eastAsia="Arial" w:hAnsi="Consolas" w:cs="Arial"/>
-                <w:lang w:val="en-US"/>
-              </w:rPr>
-              <w:t>id_categoria</w:t>
-            </w:r>
-            <w:proofErr w:type="spellEnd"/>
-            <w:r>
-              <w:rPr>
-                <w:rFonts w:ascii="Consolas" w:eastAsia="Arial" w:hAnsi="Consolas" w:cs="Arial"/>
-                <w:lang w:val="en-US"/>
-              </w:rPr>
-              <w:t>),</w:t>
-            </w:r>
-          </w:p>
-          <w:p>
-            <w:pPr>
-              <w:ind w:right="37"/>
-              <w:jc w:val="both"/>
-              <w:rPr>
-                <w:rFonts w:ascii="Consolas" w:eastAsia="Arial" w:hAnsi="Consolas" w:cs="Arial"/>
-              </w:rPr>
-            </w:pPr>
-            <w:r>
-              <w:rPr>
-                <w:rFonts w:ascii="Consolas" w:eastAsia="Arial" w:hAnsi="Consolas" w:cs="Arial"/>
-                <w:lang w:val="en-US"/>
-              </w:rPr>
-              <w:t>    </w:t>
-            </w:r>
-            <w:proofErr w:type="spellStart"/>
-            <w:r>
-              <w:rPr>
-                <w:rFonts w:ascii="Consolas" w:eastAsia="Arial" w:hAnsi="Consolas" w:cs="Arial"/>
-              </w:rPr>
-              <w:t>titulo</w:t>
-            </w:r>
-            <w:proofErr w:type="spellEnd"/>
-            <w:r>
-              <w:rPr>
-                <w:rFonts w:ascii="Consolas" w:eastAsia="Arial" w:hAnsi="Consolas" w:cs="Arial"/>
-              </w:rPr>
-              <w:t xml:space="preserve"> </w:t>
-            </w:r>
-            <w:proofErr w:type="gramStart"/>
-            <w:r>
-              <w:rPr>
-                <w:rFonts w:ascii="Consolas" w:eastAsia="Arial" w:hAnsi="Consolas" w:cs="Arial"/>
-              </w:rPr>
-              <w:t>VARCHAR(</w:t>
-            </w:r>
-            <w:proofErr w:type="gramEnd"/>
-            <w:r>
-              <w:rPr>
-                <w:rFonts w:ascii="Consolas" w:eastAsia="Arial" w:hAnsi="Consolas" w:cs="Arial"/>
-              </w:rPr>
-              <w:t>100) NOT NULL,</w:t>
-            </w:r>
-          </w:p>
-          <w:p>
-            <w:pPr>
-              <w:ind w:right="37"/>
-              <w:jc w:val="both"/>
-              <w:rPr>
-                <w:rFonts w:ascii="Consolas" w:eastAsia="Arial" w:hAnsi="Consolas" w:cs="Arial"/>
-              </w:rPr>
-            </w:pPr>
-            <w:r>
-              <w:rPr>
-                <w:rFonts w:ascii="Consolas" w:eastAsia="Arial" w:hAnsi="Consolas" w:cs="Arial"/>
-              </w:rPr>
-              <w:t>    </w:t>
-            </w:r>
-            <w:proofErr w:type="spellStart"/>
-            <w:r>
-              <w:rPr>
-                <w:rFonts w:ascii="Consolas" w:eastAsia="Arial" w:hAnsi="Consolas" w:cs="Arial"/>
-              </w:rPr>
-              <w:t>descripcion</w:t>
-            </w:r>
-            <w:proofErr w:type="spellEnd"/>
-            <w:r>
-              <w:rPr>
-                <w:rFonts w:ascii="Consolas" w:eastAsia="Arial" w:hAnsi="Consolas" w:cs="Arial"/>
-              </w:rPr>
-              <w:t xml:space="preserve"> TEXT,</w:t>
-            </w:r>
-          </w:p>
-          <w:p>
-            <w:pPr>
-              <w:ind w:right="37"/>
-              <w:jc w:val="both"/>
-              <w:rPr>
-                <w:rFonts w:ascii="Consolas" w:eastAsia="Arial" w:hAnsi="Consolas" w:cs="Arial"/>
-              </w:rPr>
-            </w:pPr>
-            <w:r>
-              <w:rPr>
-                <w:rFonts w:ascii="Consolas" w:eastAsia="Arial" w:hAnsi="Consolas" w:cs="Arial"/>
-              </w:rPr>
-              <w:t>    </w:t>
-            </w:r>
-            <w:proofErr w:type="spellStart"/>
-            <w:r>
-              <w:rPr>
-                <w:rFonts w:ascii="Consolas" w:eastAsia="Arial" w:hAnsi="Consolas" w:cs="Arial"/>
-              </w:rPr>
-              <w:t>fecha_inicio</w:t>
-            </w:r>
-            <w:proofErr w:type="spellEnd"/>
-            <w:r>
-              <w:rPr>
-                <w:rFonts w:ascii="Consolas" w:eastAsia="Arial" w:hAnsi="Consolas" w:cs="Arial"/>
-              </w:rPr>
-              <w:t xml:space="preserve"> TIMESTAMP NOT NULL,</w:t>
-            </w:r>
-          </w:p>
-          <w:p>
-            <w:pPr>
-              <w:ind w:right="37"/>
-              <w:jc w:val="both"/>
-              <w:rPr>
-                <w:rFonts w:ascii="Consolas" w:eastAsia="Arial" w:hAnsi="Consolas" w:cs="Arial"/>
-              </w:rPr>
-            </w:pPr>
-            <w:r>
-              <w:rPr>
-                <w:rFonts w:ascii="Consolas" w:eastAsia="Arial" w:hAnsi="Consolas" w:cs="Arial"/>
-              </w:rPr>
-              <w:t>    </w:t>
-            </w:r>
-            <w:proofErr w:type="spellStart"/>
-            <w:r>
-              <w:rPr>
-                <w:rFonts w:ascii="Consolas" w:eastAsia="Arial" w:hAnsi="Consolas" w:cs="Arial"/>
-              </w:rPr>
-              <w:t>fecha_fin</w:t>
-            </w:r>
-            <w:proofErr w:type="spellEnd"/>
-            <w:r>
-              <w:rPr>
-                <w:rFonts w:ascii="Consolas" w:eastAsia="Arial" w:hAnsi="Consolas" w:cs="Arial"/>
-              </w:rPr>
-              <w:t xml:space="preserve"> TIMESTAMP NOT NULL,</w:t>
-            </w:r>
-          </w:p>
-          <w:p>
-            <w:pPr>
-              <w:ind w:right="37"/>
-              <w:jc w:val="both"/>
-              <w:rPr>
-                <w:rFonts w:ascii="Consolas" w:eastAsia="Arial" w:hAnsi="Consolas" w:cs="Arial"/>
-              </w:rPr>
-            </w:pPr>
-            <w:r>
-              <w:rPr>
-                <w:rFonts w:ascii="Consolas" w:eastAsia="Arial" w:hAnsi="Consolas" w:cs="Arial"/>
-              </w:rPr>
-              <w:t xml:space="preserve">    CONSTRAINT </w:t>
-            </w:r>
-            <w:proofErr w:type="spellStart"/>
-            <w:r>
-              <w:rPr>
-                <w:rFonts w:ascii="Consolas" w:eastAsia="Arial" w:hAnsi="Consolas" w:cs="Arial"/>
-              </w:rPr>
-              <w:t>check_fechas</w:t>
-            </w:r>
-            <w:proofErr w:type="spellEnd"/>
-            <w:r>
-              <w:rPr>
-                <w:rFonts w:ascii="Consolas" w:eastAsia="Arial" w:hAnsi="Consolas" w:cs="Arial"/>
-              </w:rPr>
-              <w:t xml:space="preserve"> CHECK (</w:t>
-            </w:r>
-            <w:proofErr w:type="spellStart"/>
-            <w:r>
-              <w:rPr>
-                <w:rFonts w:ascii="Consolas" w:eastAsia="Arial" w:hAnsi="Consolas" w:cs="Arial"/>
-              </w:rPr>
-              <w:t>fecha_fin</w:t>
-            </w:r>
-            <w:proofErr w:type="spellEnd"/>
-            <w:r>
-              <w:rPr>
-                <w:rFonts w:ascii="Consolas" w:eastAsia="Arial" w:hAnsi="Consolas" w:cs="Arial"/>
-              </w:rPr>
-              <w:t xml:space="preserve"> &gt; </w:t>
-            </w:r>
-            <w:proofErr w:type="spellStart"/>
-            <w:r>
-              <w:rPr>
-                <w:rFonts w:ascii="Consolas" w:eastAsia="Arial" w:hAnsi="Consolas" w:cs="Arial"/>
-              </w:rPr>
-              <w:t>fecha_inicio</w:t>
-            </w:r>
-            <w:proofErr w:type="spellEnd"/>
-            <w:r>
-              <w:rPr>
-                <w:rFonts w:ascii="Consolas" w:eastAsia="Arial" w:hAnsi="Consolas" w:cs="Arial"/>
-              </w:rPr>
-              <w:t>)</w:t>
-            </w:r>
-            <w:r>
-              <w:rPr>
-                <w:rFonts w:ascii="Consolas" w:eastAsia="Arial" w:hAnsi="Consolas" w:cs="Arial"/>
-              </w:rPr>
-              <w:t>,</w:t>
-            </w:r>
-          </w:p>
-          <w:p>
-            <w:pPr>
-              <w:ind w:right="37"/>
-              <w:jc w:val="both"/>
-              <w:rPr>
-                <w:rFonts w:ascii="Consolas" w:eastAsia="Arial" w:hAnsi="Consolas" w:cs="Arial"/>
-              </w:rPr>
-            </w:pPr>
-            <w:r>
-              <w:rPr>
-                <w:rFonts w:ascii="Consolas" w:eastAsia="Arial" w:hAnsi="Consolas" w:cs="Arial"/>
-              </w:rPr>
-              <w:t xml:space="preserve">    </w:t>
-            </w:r>
-            <w:proofErr w:type="spellStart"/>
             <w:r>
               <w:rPr>
                 <w:rFonts w:ascii="Consolas" w:eastAsia="Arial" w:hAnsi="Consolas" w:cs="Arial"/>
                 <w:highlight w:val="yellow"/>
               </w:rPr>
-              <w:t>id_ubicacion</w:t>
-            </w:r>
-            <w:proofErr w:type="spellEnd"/>
-            <w:r>
-              <w:rPr>
-                <w:rFonts w:ascii="Consolas" w:eastAsia="Arial" w:hAnsi="Consolas" w:cs="Arial"/>
-                <w:highlight w:val="yellow"/>
-              </w:rPr>
-              <w:t xml:space="preserve"> SERIAL REFERENCES ubicaciones(</w:t>
-            </w:r>
-            <w:proofErr w:type="spellStart"/>
-            <w:r>
-              <w:rPr>
-                <w:rFonts w:ascii="Consolas" w:eastAsia="Arial" w:hAnsi="Consolas" w:cs="Arial"/>
-                <w:highlight w:val="yellow"/>
-              </w:rPr>
-              <w:t>id_ubicacion</w:t>
-            </w:r>
-            <w:proofErr w:type="spellEnd"/>
-            <w:r>
-              <w:rPr>
-                <w:rFonts w:ascii="Consolas" w:eastAsia="Arial" w:hAnsi="Consolas" w:cs="Arial"/>
-                <w:highlight w:val="yellow"/>
-              </w:rPr>
-              <w:t>)</w:t>
+              <w:t>REFERENCES ubicaciones(id_ubicacion)</w:t>
             </w:r>
           </w:p>
           <w:p>
@@ -3776,15 +2941,7 @@
                 <w:bCs/>
               </w:rPr>
               <w:lastRenderedPageBreak/>
-              <w:t>RF-1</w:t>
-            </w:r>
-            <w:r>
-              <w:rPr>
-                <w:rFonts w:ascii="Arial" w:eastAsia="Arial" w:hAnsi="Arial" w:cs="Arial"/>
-                <w:b/>
-                <w:bCs/>
-              </w:rPr>
-              <w:t>1</w:t>
+              <w:t>RF-11</w:t>
             </w:r>
           </w:p>
         </w:tc>
@@ -3862,27 +3019,7 @@
                 <w:iCs/>
                 <w:color w:val="000000"/>
               </w:rPr>
-              <w:t xml:space="preserve">El sistema deberá incorporar un módulo de gestión de disponibilidad para optimizar la coordinación de agendas personales. Actualmente, si bien los usuarios tienen la capacidad de crear eventos, el modelo carece de un mecanismo formal para conocer los periodos de tiempo en los que una persona se encuentra libre u ocupada. Para dar solución a esto, se implementará la entidad disponibilidades, vinculada directamente al perfil de cada usuario, en conjunto con un catálogo de </w:t>
-            </w:r>
-            <w:proofErr w:type="spellStart"/>
-            <w:r>
-              <w:rPr>
-                <w:rFonts w:ascii="Arial" w:eastAsia="Times New Roman" w:hAnsi="Arial" w:cs="Arial"/>
-                <w:i/>
-                <w:iCs/>
-                <w:color w:val="000000"/>
-              </w:rPr>
-              <w:t>tipos_disponibilidad</w:t>
-            </w:r>
-            <w:proofErr w:type="spellEnd"/>
-            <w:r>
-              <w:rPr>
-                <w:rFonts w:ascii="Arial" w:eastAsia="Times New Roman" w:hAnsi="Arial" w:cs="Arial"/>
-                <w:i/>
-                <w:iCs/>
-                <w:color w:val="000000"/>
-              </w:rPr>
-              <w:t xml:space="preserve"> (tales como disponible, ocupado o no disponible). Cada franja de disponibilidad registrará de forma obligatoria el usuario asociado, la fecha correspondiente, la hora de inicio, la hora de fin y el estado o tipo que define su condición temporal, permitiendo a los usuarios administrar sus periodos de tiempo libres u ocupados mediante operaciones CRUD (crear, editar, consultar y eliminar franjas) desde la interfaz.</w:t>
+              <w:t>El sistema deberá incorporar un módulo de gestión de disponibilidad para optimizar la coordinación de agendas personales. Actualmente, si bien los usuarios tienen la capacidad de crear eventos, el modelo carece de un mecanismo formal para conocer los periodos de tiempo en los que una persona se encuentra libre u ocupada. Para dar solución a esto, se implementará la entidad disponibilidades, vinculada directamente al perfil de cada usuario, en conjunto con un catálogo de tipos_disponibilidad (tales como disponible, ocupado o no disponible). Cada franja de disponibilidad registrará de forma obligatoria el usuario asociado, la fecha correspondiente, la hora de inicio, la hora de fin y el estado o tipo que define su condición temporal, permitiendo a los usuarios administrar sus periodos de tiempo libres u ocupados mediante operaciones CRUD (crear, editar, consultar y eliminar franjas) desde la interfaz.</w:t>
             </w:r>
           </w:p>
         </w:tc>
@@ -3930,63 +3067,7 @@
               <w:rPr>
                 <w:rFonts w:ascii="Arial" w:eastAsia="Arial" w:hAnsi="Arial" w:cs="Arial"/>
               </w:rPr>
-              <w:t xml:space="preserve">Se define una entidad llamada ‘disponibilidad’ que se vincula a la tabla de usuarios. Esta nueva entidad contendrá los atributos de fecha, </w:t>
-            </w:r>
-            <w:proofErr w:type="spellStart"/>
-            <w:r>
-              <w:rPr>
-                <w:rFonts w:ascii="Arial" w:eastAsia="Arial" w:hAnsi="Arial" w:cs="Arial"/>
-              </w:rPr>
-              <w:t>hora_inicio</w:t>
-            </w:r>
-            <w:proofErr w:type="spellEnd"/>
-            <w:r>
-              <w:rPr>
-                <w:rFonts w:ascii="Arial" w:eastAsia="Arial" w:hAnsi="Arial" w:cs="Arial"/>
-              </w:rPr>
-              <w:t xml:space="preserve">, </w:t>
-            </w:r>
-            <w:proofErr w:type="spellStart"/>
-            <w:r>
-              <w:rPr>
-                <w:rFonts w:ascii="Arial" w:eastAsia="Arial" w:hAnsi="Arial" w:cs="Arial"/>
-              </w:rPr>
-              <w:t>hora_fin</w:t>
-            </w:r>
-            <w:proofErr w:type="spellEnd"/>
-            <w:r>
-              <w:rPr>
-                <w:rFonts w:ascii="Arial" w:eastAsia="Arial" w:hAnsi="Arial" w:cs="Arial"/>
-              </w:rPr>
-              <w:t xml:space="preserve">, </w:t>
-            </w:r>
-            <w:proofErr w:type="spellStart"/>
-            <w:r>
-              <w:rPr>
-                <w:rFonts w:ascii="Arial" w:eastAsia="Arial" w:hAnsi="Arial" w:cs="Arial"/>
-              </w:rPr>
-              <w:t>tipo_disponibilidad</w:t>
-            </w:r>
-            <w:proofErr w:type="spellEnd"/>
-            <w:r>
-              <w:rPr>
-                <w:rFonts w:ascii="Arial" w:eastAsia="Arial" w:hAnsi="Arial" w:cs="Arial"/>
-              </w:rPr>
-              <w:t xml:space="preserve">; que representa la llave primaria y el </w:t>
-            </w:r>
-            <w:proofErr w:type="spellStart"/>
-            <w:r>
-              <w:rPr>
-                <w:rFonts w:ascii="Arial" w:eastAsia="Arial" w:hAnsi="Arial" w:cs="Arial"/>
-              </w:rPr>
-              <w:t>id_usuario</w:t>
-            </w:r>
-            <w:proofErr w:type="spellEnd"/>
-            <w:r>
-              <w:rPr>
-                <w:rFonts w:ascii="Arial" w:eastAsia="Arial" w:hAnsi="Arial" w:cs="Arial"/>
-              </w:rPr>
-              <w:t xml:space="preserve">, que corresponde a una clave foránea a la tabla de usuarios. La representación de modelo conceptual se verá así: </w:t>
+              <w:t xml:space="preserve">Se define una entidad llamada ‘disponibilidad’ que se vincula a la tabla de usuarios. Esta nueva entidad contendrá los atributos de fecha, hora_inicio, hora_fin, tipo_disponibilidad; que representa la llave primaria y el id_usuario, que corresponde a una clave foránea a la tabla de usuarios. La representación de modelo conceptual se verá así: </w:t>
             </w:r>
           </w:p>
           <w:p>
@@ -4115,96 +3196,8 @@
               <w:rPr>
                 <w:rFonts w:ascii="Consolas" w:eastAsia="Arial" w:hAnsi="Consolas" w:cs="Arial"/>
               </w:rPr>
-              <w:t>isponibilidad</w:t>
-            </w:r>
-            <w:r>
-              <w:rPr>
-                <w:rFonts w:ascii="Consolas" w:eastAsia="Arial" w:hAnsi="Consolas" w:cs="Arial"/>
-              </w:rPr>
-              <w:t>(</w:t>
-            </w:r>
-            <w:r>
-              <w:rPr>
-                <w:rFonts w:ascii="Consolas" w:eastAsia="Arial" w:hAnsi="Consolas" w:cs="Arial"/>
-              </w:rPr>
-              <w:t>tipo_</w:t>
-            </w:r>
-            <w:proofErr w:type="gramStart"/>
-            <w:r>
-              <w:rPr>
-                <w:rFonts w:ascii="Consolas" w:eastAsia="Arial" w:hAnsi="Consolas" w:cs="Arial"/>
-              </w:rPr>
-              <w:t>disponibilidad</w:t>
-            </w:r>
-            <w:r>
-              <w:rPr>
-                <w:rFonts w:ascii="Consolas" w:eastAsia="Arial" w:hAnsi="Consolas" w:cs="Arial"/>
-              </w:rPr>
-              <w:t>[</w:t>
-            </w:r>
-            <w:proofErr w:type="gramEnd"/>
-            <w:r>
-              <w:rPr>
-                <w:rFonts w:ascii="Consolas" w:eastAsia="Arial" w:hAnsi="Consolas" w:cs="Arial"/>
-              </w:rPr>
-              <w:t>PK</w:t>
-            </w:r>
-            <w:proofErr w:type="gramStart"/>
-            <w:r>
-              <w:rPr>
-                <w:rFonts w:ascii="Consolas" w:eastAsia="Arial" w:hAnsi="Consolas" w:cs="Arial"/>
-              </w:rPr>
-              <w:t>],</w:t>
-            </w:r>
-            <w:r>
-              <w:rPr>
-                <w:rFonts w:ascii="Consolas" w:eastAsia="Arial" w:hAnsi="Consolas" w:cs="Arial"/>
-              </w:rPr>
-              <w:t>fecha</w:t>
-            </w:r>
-            <w:proofErr w:type="gramEnd"/>
-            <w:r>
-              <w:rPr>
-                <w:rFonts w:ascii="Consolas" w:eastAsia="Arial" w:hAnsi="Consolas" w:cs="Arial"/>
-              </w:rPr>
-              <w:t>,hora_</w:t>
-            </w:r>
-            <w:proofErr w:type="gramStart"/>
-            <w:r>
-              <w:rPr>
-                <w:rFonts w:ascii="Consolas" w:eastAsia="Arial" w:hAnsi="Consolas" w:cs="Arial"/>
-              </w:rPr>
-              <w:t>inicio,hora</w:t>
-            </w:r>
-            <w:proofErr w:type="gramEnd"/>
-            <w:r>
-              <w:rPr>
-                <w:rFonts w:ascii="Consolas" w:eastAsia="Arial" w:hAnsi="Consolas" w:cs="Arial"/>
-              </w:rPr>
-              <w:t>_</w:t>
-            </w:r>
-            <w:proofErr w:type="gramStart"/>
-            <w:r>
-              <w:rPr>
-                <w:rFonts w:ascii="Consolas" w:eastAsia="Arial" w:hAnsi="Consolas" w:cs="Arial"/>
-              </w:rPr>
-              <w:t>fin,id</w:t>
-            </w:r>
-            <w:proofErr w:type="gramEnd"/>
-            <w:r>
-              <w:rPr>
-                <w:rFonts w:ascii="Consolas" w:eastAsia="Arial" w:hAnsi="Consolas" w:cs="Arial"/>
-              </w:rPr>
-              <w:t>_</w:t>
-            </w:r>
-            <w:proofErr w:type="gramStart"/>
-            <w:r>
-              <w:rPr>
-                <w:rFonts w:ascii="Consolas" w:eastAsia="Arial" w:hAnsi="Consolas" w:cs="Arial"/>
-              </w:rPr>
-              <w:t>ubicacion[</w:t>
-            </w:r>
-            <w:proofErr w:type="gramEnd"/>
+              <w:t>isponibilidad(tipo_disponibilidad[PK],fecha,hora_inicio,hora_fin,id_ubicacion[</w:t>
+            </w:r>
             <w:r>
               <w:rPr>
                 <w:rFonts w:ascii="Consolas" w:eastAsia="Arial" w:hAnsi="Consolas" w:cs="Arial"/>
@@ -4215,13 +3208,7 @@
               <w:rPr>
                 <w:rFonts w:ascii="Consolas" w:eastAsia="Arial" w:hAnsi="Consolas" w:cs="Arial"/>
               </w:rPr>
-              <w:t>K]</w:t>
-            </w:r>
-            <w:r>
-              <w:rPr>
-                <w:rFonts w:ascii="Consolas" w:eastAsia="Arial" w:hAnsi="Consolas" w:cs="Arial"/>
-              </w:rPr>
-              <w:t>)</w:t>
+              <w:t>K])</w:t>
             </w:r>
           </w:p>
         </w:tc>
@@ -4301,41 +3288,13 @@
               <w:rPr>
                 <w:rFonts w:ascii="Arial" w:eastAsia="Arial" w:hAnsi="Arial" w:cs="Arial"/>
               </w:rPr>
-              <w:t xml:space="preserve">y se hace referencia de la clave foránea del </w:t>
-            </w:r>
-            <w:proofErr w:type="spellStart"/>
-            <w:r>
-              <w:rPr>
-                <w:rFonts w:ascii="Arial" w:eastAsia="Arial" w:hAnsi="Arial" w:cs="Arial"/>
-              </w:rPr>
-              <w:t>id_ubicacion</w:t>
-            </w:r>
-            <w:proofErr w:type="spellEnd"/>
-            <w:r>
-              <w:rPr>
-                <w:rFonts w:ascii="Arial" w:eastAsia="Arial" w:hAnsi="Arial" w:cs="Arial"/>
-              </w:rPr>
-              <w:t xml:space="preserve"> mediante </w:t>
-            </w:r>
-            <w:r>
-              <w:rPr>
-                <w:rFonts w:ascii="Consolas" w:eastAsia="Arial" w:hAnsi="Consolas" w:cs="Arial"/>
-              </w:rPr>
-              <w:t>REFERENCES ubicaciones(</w:t>
-            </w:r>
-            <w:proofErr w:type="spellStart"/>
-            <w:r>
-              <w:rPr>
-                <w:rFonts w:ascii="Consolas" w:eastAsia="Arial" w:hAnsi="Consolas" w:cs="Arial"/>
-              </w:rPr>
-              <w:t>id_ubicacion</w:t>
-            </w:r>
-            <w:proofErr w:type="spellEnd"/>
-            <w:r>
-              <w:rPr>
-                <w:rFonts w:ascii="Consolas" w:eastAsia="Arial" w:hAnsi="Consolas" w:cs="Arial"/>
-              </w:rPr>
-              <w:t>)</w:t>
+              <w:t xml:space="preserve">y se hace referencia de la clave foránea del id_ubicacion mediante </w:t>
+            </w:r>
+            <w:r>
+              <w:rPr>
+                <w:rFonts w:ascii="Consolas" w:eastAsia="Arial" w:hAnsi="Consolas" w:cs="Arial"/>
+              </w:rPr>
+              <w:t>REFERENCES ubicaciones(id_ubicacion)</w:t>
             </w:r>
             <w:r>
               <w:rPr>
@@ -4363,171 +3322,113 @@
               <w:rPr>
                 <w:rFonts w:ascii="Consolas" w:eastAsia="Arial" w:hAnsi="Consolas" w:cs="Arial"/>
               </w:rPr>
-              <w:t xml:space="preserve">CREATE TABLE </w:t>
-            </w:r>
-            <w:r>
-              <w:rPr>
-                <w:rFonts w:ascii="Consolas" w:eastAsia="Arial" w:hAnsi="Consolas" w:cs="Arial"/>
-              </w:rPr>
-              <w:t>disponibilidad</w:t>
-            </w:r>
-            <w:r>
-              <w:rPr>
-                <w:rFonts w:ascii="Consolas" w:eastAsia="Arial" w:hAnsi="Consolas" w:cs="Arial"/>
-              </w:rPr>
-              <w:t xml:space="preserve"> (</w:t>
-            </w:r>
-          </w:p>
-          <w:p>
-            <w:pPr>
-              <w:jc w:val="both"/>
-              <w:rPr>
-                <w:rFonts w:ascii="Consolas" w:eastAsia="Arial" w:hAnsi="Consolas" w:cs="Arial"/>
-              </w:rPr>
-            </w:pPr>
-            <w:r>
-              <w:rPr>
-                <w:rFonts w:ascii="Consolas" w:eastAsia="Arial" w:hAnsi="Consolas" w:cs="Arial"/>
-              </w:rPr>
-              <w:t>    </w:t>
-            </w:r>
-            <w:proofErr w:type="spellStart"/>
-            <w:r>
-              <w:rPr>
-                <w:rFonts w:ascii="Consolas" w:eastAsia="Arial" w:hAnsi="Consolas" w:cs="Arial"/>
-              </w:rPr>
-              <w:t>tipo_disponibilidad</w:t>
-            </w:r>
-            <w:proofErr w:type="spellEnd"/>
-            <w:r>
-              <w:rPr>
-                <w:rFonts w:ascii="Consolas" w:eastAsia="Arial" w:hAnsi="Consolas" w:cs="Arial"/>
-              </w:rPr>
-              <w:t xml:space="preserve"> PRIMARY KEY,</w:t>
-            </w:r>
-          </w:p>
-          <w:p>
-            <w:pPr>
-              <w:jc w:val="both"/>
-              <w:rPr>
-                <w:rFonts w:ascii="Consolas" w:eastAsia="Arial" w:hAnsi="Consolas" w:cs="Arial"/>
-              </w:rPr>
-            </w:pPr>
-            <w:r>
-              <w:rPr>
-                <w:rFonts w:ascii="Consolas" w:eastAsia="Arial" w:hAnsi="Consolas" w:cs="Arial"/>
-              </w:rPr>
-              <w:t>    </w:t>
-            </w:r>
-            <w:r>
-              <w:rPr>
-                <w:rFonts w:ascii="Consolas" w:eastAsia="Arial" w:hAnsi="Consolas" w:cs="Arial"/>
-              </w:rPr>
-              <w:t>fecha TIMESTAMP</w:t>
-            </w:r>
-            <w:r>
-              <w:rPr>
-                <w:rFonts w:ascii="Consolas" w:eastAsia="Arial" w:hAnsi="Consolas" w:cs="Arial"/>
-              </w:rPr>
-              <w:t xml:space="preserve"> NOT NULL,</w:t>
-            </w:r>
-          </w:p>
-          <w:p>
-            <w:pPr>
-              <w:jc w:val="both"/>
-              <w:rPr>
-                <w:rFonts w:ascii="Consolas" w:eastAsia="Arial" w:hAnsi="Consolas" w:cs="Arial"/>
-              </w:rPr>
-            </w:pPr>
-            <w:r>
-              <w:rPr>
-                <w:rFonts w:ascii="Consolas" w:eastAsia="Arial" w:hAnsi="Consolas" w:cs="Arial"/>
-              </w:rPr>
-              <w:t>    </w:t>
-            </w:r>
-            <w:proofErr w:type="spellStart"/>
-            <w:r>
-              <w:rPr>
-                <w:rFonts w:ascii="Consolas" w:eastAsia="Arial" w:hAnsi="Consolas" w:cs="Arial"/>
-              </w:rPr>
-              <w:t>hora_inicio</w:t>
-            </w:r>
-            <w:proofErr w:type="spellEnd"/>
-            <w:r>
-              <w:rPr>
-                <w:rFonts w:ascii="Consolas" w:eastAsia="Arial" w:hAnsi="Consolas" w:cs="Arial"/>
-              </w:rPr>
-              <w:t xml:space="preserve"> NOT NULL,</w:t>
-            </w:r>
-          </w:p>
-          <w:p>
-            <w:pPr>
-              <w:jc w:val="both"/>
-              <w:rPr>
-                <w:rFonts w:ascii="Consolas" w:eastAsia="Arial" w:hAnsi="Consolas" w:cs="Arial"/>
-              </w:rPr>
-            </w:pPr>
-            <w:r>
-              <w:rPr>
-                <w:rFonts w:ascii="Consolas" w:eastAsia="Arial" w:hAnsi="Consolas" w:cs="Arial"/>
-              </w:rPr>
-              <w:t xml:space="preserve">    </w:t>
-            </w:r>
-            <w:proofErr w:type="spellStart"/>
-            <w:r>
-              <w:rPr>
-                <w:rFonts w:ascii="Consolas" w:eastAsia="Arial" w:hAnsi="Consolas" w:cs="Arial"/>
-              </w:rPr>
-              <w:t>hora_fin</w:t>
-            </w:r>
-            <w:proofErr w:type="spellEnd"/>
-            <w:r>
-              <w:rPr>
-                <w:rFonts w:ascii="Consolas" w:eastAsia="Arial" w:hAnsi="Consolas" w:cs="Arial"/>
-              </w:rPr>
-              <w:t xml:space="preserve"> NOT NULL,</w:t>
-            </w:r>
-          </w:p>
-          <w:p>
-            <w:pPr>
-              <w:jc w:val="both"/>
-              <w:rPr>
-                <w:rFonts w:ascii="Consolas" w:eastAsia="Arial" w:hAnsi="Consolas" w:cs="Arial"/>
-              </w:rPr>
-            </w:pPr>
-            <w:r>
-              <w:rPr>
-                <w:rFonts w:ascii="Consolas" w:eastAsia="Arial" w:hAnsi="Consolas" w:cs="Arial"/>
-              </w:rPr>
-              <w:t xml:space="preserve">    </w:t>
-            </w:r>
-            <w:proofErr w:type="spellStart"/>
-            <w:r>
-              <w:rPr>
-                <w:rFonts w:ascii="Consolas" w:eastAsia="Arial" w:hAnsi="Consolas" w:cs="Arial"/>
-              </w:rPr>
-              <w:t>id_ubicacion</w:t>
-            </w:r>
-            <w:proofErr w:type="spellEnd"/>
-            <w:r>
-              <w:rPr>
-                <w:rFonts w:ascii="Consolas" w:eastAsia="Arial" w:hAnsi="Consolas" w:cs="Arial"/>
-              </w:rPr>
-              <w:t xml:space="preserve"> SERIAL REFERENCES ubicaciones(</w:t>
-            </w:r>
-            <w:proofErr w:type="spellStart"/>
-            <w:r>
-              <w:rPr>
-                <w:rFonts w:ascii="Consolas" w:eastAsia="Arial" w:hAnsi="Consolas" w:cs="Arial"/>
-              </w:rPr>
-              <w:t>id_ubicacion</w:t>
-            </w:r>
-            <w:proofErr w:type="spellEnd"/>
-            <w:r>
-              <w:rPr>
-                <w:rFonts w:ascii="Consolas" w:eastAsia="Arial" w:hAnsi="Consolas" w:cs="Arial"/>
-              </w:rPr>
-              <w:t>)</w:t>
+              <w:t>CREATE TABLE disponibilidad (</w:t>
+            </w:r>
+          </w:p>
+          <w:p>
+            <w:pPr>
+              <w:jc w:val="both"/>
+              <w:rPr>
+                <w:rFonts w:ascii="Consolas" w:eastAsia="Arial" w:hAnsi="Consolas" w:cs="Arial"/>
+              </w:rPr>
+            </w:pPr>
+            <w:r>
+              <w:rPr>
+                <w:rFonts w:ascii="Consolas" w:eastAsia="Arial" w:hAnsi="Consolas" w:cs="Arial"/>
+              </w:rPr>
+              <w:t xml:space="preserve">    tipo_disponibilidad </w:t>
+            </w:r>
+            <w:r>
+              <w:rPr>
+                <w:rFonts w:ascii="Consolas" w:eastAsia="Arial" w:hAnsi="Consolas" w:cs="Arial"/>
+              </w:rPr>
+              <w:t xml:space="preserve">VARCHAR(15) </w:t>
+            </w:r>
+            <w:r>
+              <w:rPr>
+                <w:rFonts w:ascii="Consolas" w:eastAsia="Arial" w:hAnsi="Consolas" w:cs="Arial"/>
+              </w:rPr>
+              <w:t>PRIMARY KEY,</w:t>
+            </w:r>
+          </w:p>
+          <w:p>
+            <w:pPr>
+              <w:jc w:val="both"/>
+              <w:rPr>
+                <w:rFonts w:ascii="Consolas" w:eastAsia="Arial" w:hAnsi="Consolas" w:cs="Arial"/>
+              </w:rPr>
+            </w:pPr>
+            <w:r>
+              <w:rPr>
+                <w:rFonts w:ascii="Consolas" w:eastAsia="Arial" w:hAnsi="Consolas" w:cs="Arial"/>
+              </w:rPr>
+              <w:t>    fecha TIMESTAMP NOT NULL,</w:t>
+            </w:r>
+          </w:p>
+          <w:p>
+            <w:pPr>
+              <w:jc w:val="both"/>
+              <w:rPr>
+                <w:rFonts w:ascii="Consolas" w:eastAsia="Arial" w:hAnsi="Consolas" w:cs="Arial"/>
+              </w:rPr>
+            </w:pPr>
+            <w:r>
+              <w:rPr>
+                <w:rFonts w:ascii="Consolas" w:eastAsia="Arial" w:hAnsi="Consolas" w:cs="Arial"/>
+              </w:rPr>
+              <w:t xml:space="preserve">    hora_inicio </w:t>
+            </w:r>
+            <w:r>
+              <w:rPr>
+                <w:rFonts w:ascii="Consolas" w:eastAsia="Arial" w:hAnsi="Consolas" w:cs="Arial"/>
+              </w:rPr>
+              <w:t xml:space="preserve">TIMESTAMP </w:t>
+            </w:r>
+            <w:r>
+              <w:rPr>
+                <w:rFonts w:ascii="Consolas" w:eastAsia="Arial" w:hAnsi="Consolas" w:cs="Arial"/>
+              </w:rPr>
+              <w:t>NOT NULL,</w:t>
+            </w:r>
+          </w:p>
+          <w:p>
+            <w:pPr>
+              <w:jc w:val="both"/>
+              <w:rPr>
+                <w:rFonts w:ascii="Consolas" w:eastAsia="Arial" w:hAnsi="Consolas" w:cs="Arial"/>
+              </w:rPr>
+            </w:pPr>
+            <w:r>
+              <w:rPr>
+                <w:rFonts w:ascii="Consolas" w:eastAsia="Arial" w:hAnsi="Consolas" w:cs="Arial"/>
+              </w:rPr>
+              <w:t xml:space="preserve">    hora_fin </w:t>
+            </w:r>
+            <w:r>
+              <w:rPr>
+                <w:rFonts w:ascii="Consolas" w:eastAsia="Arial" w:hAnsi="Consolas" w:cs="Arial"/>
+              </w:rPr>
+              <w:t xml:space="preserve">TIMESTAMP </w:t>
+            </w:r>
+            <w:r>
+              <w:rPr>
+                <w:rFonts w:ascii="Consolas" w:eastAsia="Arial" w:hAnsi="Consolas" w:cs="Arial"/>
+              </w:rPr>
+              <w:t>NOT NULL,</w:t>
+            </w:r>
+          </w:p>
+          <w:p>
+            <w:pPr>
+              <w:jc w:val="both"/>
+              <w:rPr>
+                <w:rFonts w:ascii="Consolas" w:eastAsia="Arial" w:hAnsi="Consolas" w:cs="Arial"/>
+              </w:rPr>
+            </w:pPr>
+            <w:r>
+              <w:rPr>
+                <w:rFonts w:ascii="Consolas" w:eastAsia="Arial" w:hAnsi="Consolas" w:cs="Arial"/>
+              </w:rPr>
+              <w:t xml:space="preserve">    id_ubicacion REFERENCES ubicaciones(id_ubicacion)</w:t>
             </w:r>
           </w:p>
           <w:p>
@@ -4653,15 +3554,7 @@
                 <w:bCs/>
               </w:rPr>
               <w:lastRenderedPageBreak/>
-              <w:t>RF-1</w:t>
-            </w:r>
-            <w:r>
-              <w:rPr>
-                <w:rFonts w:ascii="Arial" w:eastAsia="Arial" w:hAnsi="Arial" w:cs="Arial"/>
-                <w:b/>
-                <w:bCs/>
-              </w:rPr>
-              <w:t>2</w:t>
+              <w:t>RF-12</w:t>
             </w:r>
           </w:p>
         </w:tc>
@@ -4838,19 +3731,17 @@
               </w:rPr>
               <w:t xml:space="preserve">SELECT </w:t>
             </w:r>
-            <w:proofErr w:type="gramStart"/>
-            <w:r>
-              <w:rPr>
-                <w:rFonts w:ascii="Consolas" w:eastAsia="Arial" w:hAnsi="Consolas" w:cs="Arial"/>
-              </w:rPr>
-              <w:t>eventos.e</w:t>
-            </w:r>
-            <w:proofErr w:type="gramEnd"/>
-            <w:r>
-              <w:rPr>
-                <w:rFonts w:ascii="Consolas" w:eastAsia="Arial" w:hAnsi="Consolas" w:cs="Arial"/>
-              </w:rPr>
-              <w:t xml:space="preserve">1 </w:t>
+            <w:r>
+              <w:rPr>
+                <w:rFonts w:ascii="Consolas" w:eastAsia="Arial" w:hAnsi="Consolas" w:cs="Arial"/>
+              </w:rPr>
+              <w:t>e1.id_evento,</w:t>
+            </w:r>
+            <w:r>
+              <w:rPr>
+                <w:rFonts w:ascii="Consolas" w:eastAsia="Arial" w:hAnsi="Consolas" w:cs="Arial"/>
+              </w:rPr>
+              <w:t xml:space="preserve"> </w:t>
             </w:r>
           </w:p>
           <w:p>
@@ -4867,19 +3758,11 @@
               </w:rPr>
               <w:t xml:space="preserve">       </w:t>
             </w:r>
-            <w:proofErr w:type="gramStart"/>
-            <w:r>
-              <w:rPr>
-                <w:rFonts w:ascii="Consolas" w:eastAsia="Arial" w:hAnsi="Consolas" w:cs="Arial"/>
-              </w:rPr>
-              <w:t>eventos.e</w:t>
-            </w:r>
-            <w:proofErr w:type="gramEnd"/>
-            <w:r>
-              <w:rPr>
-                <w:rFonts w:ascii="Consolas" w:eastAsia="Arial" w:hAnsi="Consolas" w:cs="Arial"/>
-              </w:rPr>
-              <w:t>2</w:t>
+            <w:r>
+              <w:rPr>
+                <w:rFonts w:ascii="Consolas" w:eastAsia="Arial" w:hAnsi="Consolas" w:cs="Arial"/>
+              </w:rPr>
+              <w:t>e2.id_evento</w:t>
             </w:r>
           </w:p>
           <w:p>
@@ -4900,35 +3783,19 @@
               <w:rPr>
                 <w:rFonts w:ascii="Consolas" w:eastAsia="Arial" w:hAnsi="Consolas" w:cs="Arial"/>
               </w:rPr>
-              <w:t>2 WHERE e</w:t>
-            </w:r>
-            <w:proofErr w:type="gramStart"/>
-            <w:r>
-              <w:rPr>
-                <w:rFonts w:ascii="Consolas" w:eastAsia="Arial" w:hAnsi="Consolas" w:cs="Arial"/>
-              </w:rPr>
-              <w:t>1.fecha</w:t>
-            </w:r>
-            <w:proofErr w:type="gramEnd"/>
-            <w:r>
-              <w:rPr>
-                <w:rFonts w:ascii="Consolas" w:eastAsia="Arial" w:hAnsi="Consolas" w:cs="Arial"/>
-              </w:rPr>
-              <w:t>_fin &gt; e</w:t>
-            </w:r>
-            <w:proofErr w:type="gramStart"/>
-            <w:r>
-              <w:rPr>
-                <w:rFonts w:ascii="Consolas" w:eastAsia="Arial" w:hAnsi="Consolas" w:cs="Arial"/>
-              </w:rPr>
-              <w:t>2.fecha</w:t>
-            </w:r>
-            <w:proofErr w:type="gramEnd"/>
-            <w:r>
-              <w:rPr>
-                <w:rFonts w:ascii="Consolas" w:eastAsia="Arial" w:hAnsi="Consolas" w:cs="Arial"/>
-              </w:rPr>
-              <w:t>_inicio</w:t>
+              <w:t xml:space="preserve">2 </w:t>
+            </w:r>
+            <w:r>
+              <w:rPr>
+                <w:rFonts w:ascii="Consolas" w:eastAsia="Arial" w:hAnsi="Consolas" w:cs="Arial"/>
+              </w:rPr>
+              <w:t xml:space="preserve">ON </w:t>
+            </w:r>
+            <w:r>
+              <w:rPr>
+                <w:rFonts w:ascii="Consolas" w:eastAsia="Arial" w:hAnsi="Consolas" w:cs="Arial"/>
+              </w:rPr>
+              <w:t>WHERE e1.fecha_fin &gt; e2.fecha_inicio</w:t>
             </w:r>
           </w:p>
         </w:tc>
@@ -5043,15 +3910,7 @@
                 <w:bCs/>
               </w:rPr>
               <w:lastRenderedPageBreak/>
-              <w:t>RF-1</w:t>
-            </w:r>
-            <w:r>
-              <w:rPr>
-                <w:rFonts w:ascii="Arial" w:eastAsia="Arial" w:hAnsi="Arial" w:cs="Arial"/>
-                <w:b/>
-                <w:bCs/>
-              </w:rPr>
-              <w:t>5</w:t>
+              <w:t>RF-15</w:t>
             </w:r>
           </w:p>
         </w:tc>
@@ -5180,35 +4039,7 @@
               <w:rPr>
                 <w:rFonts w:ascii="Arial" w:eastAsia="Arial" w:hAnsi="Arial" w:cs="Arial"/>
               </w:rPr>
-              <w:t xml:space="preserve">Se crea la entidad de nombre ‘tarea’ con seis atributos: título, como llave primaria, prioridad, </w:t>
-            </w:r>
-            <w:proofErr w:type="spellStart"/>
-            <w:r>
-              <w:rPr>
-                <w:rFonts w:ascii="Arial" w:eastAsia="Arial" w:hAnsi="Arial" w:cs="Arial"/>
-              </w:rPr>
-              <w:t>fecha_limite</w:t>
-            </w:r>
-            <w:proofErr w:type="spellEnd"/>
-            <w:r>
-              <w:rPr>
-                <w:rFonts w:ascii="Arial" w:eastAsia="Arial" w:hAnsi="Arial" w:cs="Arial"/>
-              </w:rPr>
-              <w:t xml:space="preserve">, descripción, </w:t>
-            </w:r>
-            <w:proofErr w:type="spellStart"/>
-            <w:r>
-              <w:rPr>
-                <w:rFonts w:ascii="Arial" w:eastAsia="Arial" w:hAnsi="Arial" w:cs="Arial"/>
-              </w:rPr>
-              <w:t>id_usuario</w:t>
-            </w:r>
-            <w:proofErr w:type="spellEnd"/>
-            <w:r>
-              <w:rPr>
-                <w:rFonts w:ascii="Arial" w:eastAsia="Arial" w:hAnsi="Arial" w:cs="Arial"/>
-              </w:rPr>
-              <w:t xml:space="preserve">, como llave foránea y estado, que puede ser pendiente, en progreso, completada o cancelada. </w:t>
+              <w:t xml:space="preserve">Se crea la entidad de nombre ‘tarea’ con seis atributos: título, como llave primaria, prioridad, fecha_limite, descripción, id_usuario, como llave foránea y estado, que puede ser pendiente, en progreso, completada o cancelada. </w:t>
             </w:r>
           </w:p>
           <w:p>
@@ -5308,21 +4139,7 @@
               <w:rPr>
                 <w:rFonts w:ascii="Arial" w:eastAsia="Arial" w:hAnsi="Arial" w:cs="Arial"/>
               </w:rPr>
-              <w:t xml:space="preserve">Dentro de la interfaz del sistema, el usuario será capaz de crear, leer, actualizar o eliminar tareas, por lo tanto, se establece una relación de GESTIONA con cardinalidad </w:t>
-            </w:r>
-            <w:proofErr w:type="gramStart"/>
-            <w:r>
-              <w:rPr>
-                <w:rFonts w:ascii="Arial" w:eastAsia="Arial" w:hAnsi="Arial" w:cs="Arial"/>
-              </w:rPr>
-              <w:t>1:N</w:t>
-            </w:r>
-            <w:proofErr w:type="gramEnd"/>
-            <w:r>
-              <w:rPr>
-                <w:rFonts w:ascii="Arial" w:eastAsia="Arial" w:hAnsi="Arial" w:cs="Arial"/>
-              </w:rPr>
-              <w:t xml:space="preserve">, donde 1 usuario puede gestionar N tareas: </w:t>
+              <w:t xml:space="preserve">Dentro de la interfaz del sistema, el usuario será capaz de crear, leer, actualizar o eliminar tareas, por lo tanto, se establece una relación de GESTIONA con cardinalidad 1:N, donde 1 usuario puede gestionar N tareas: </w:t>
             </w:r>
           </w:p>
           <w:p>
@@ -5453,125 +4270,7 @@
               <w:rPr>
                 <w:rFonts w:ascii="Consolas" w:eastAsia="Arial" w:hAnsi="Consolas" w:cs="Arial"/>
               </w:rPr>
-              <w:t>tareas</w:t>
-            </w:r>
-            <w:r>
-              <w:rPr>
-                <w:rFonts w:ascii="Consolas" w:eastAsia="Arial" w:hAnsi="Consolas" w:cs="Arial"/>
-              </w:rPr>
-              <w:t xml:space="preserve"> (</w:t>
-            </w:r>
-            <w:proofErr w:type="gramStart"/>
-            <w:r>
-              <w:rPr>
-                <w:rFonts w:ascii="Consolas" w:eastAsia="Arial" w:hAnsi="Consolas" w:cs="Arial"/>
-              </w:rPr>
-              <w:t>titulo</w:t>
-            </w:r>
-            <w:r>
-              <w:rPr>
-                <w:rFonts w:ascii="Consolas" w:eastAsia="Arial" w:hAnsi="Consolas" w:cs="Arial"/>
-              </w:rPr>
-              <w:t>[</w:t>
-            </w:r>
-            <w:proofErr w:type="gramEnd"/>
-            <w:r>
-              <w:rPr>
-                <w:rFonts w:ascii="Consolas" w:eastAsia="Arial" w:hAnsi="Consolas" w:cs="Arial"/>
-              </w:rPr>
-              <w:t>PK</w:t>
-            </w:r>
-            <w:proofErr w:type="gramStart"/>
-            <w:r>
-              <w:rPr>
-                <w:rFonts w:ascii="Consolas" w:eastAsia="Arial" w:hAnsi="Consolas" w:cs="Arial"/>
-              </w:rPr>
-              <w:t>],</w:t>
-            </w:r>
-            <w:r>
-              <w:rPr>
-                <w:rFonts w:ascii="Consolas" w:eastAsia="Arial" w:hAnsi="Consolas" w:cs="Arial"/>
-              </w:rPr>
-              <w:t>estado</w:t>
-            </w:r>
-            <w:proofErr w:type="gramEnd"/>
-            <w:r>
-              <w:rPr>
-                <w:rFonts w:ascii="Consolas" w:eastAsia="Arial" w:hAnsi="Consolas" w:cs="Arial"/>
-              </w:rPr>
-              <w:t>,</w:t>
-            </w:r>
-            <w:proofErr w:type="gramStart"/>
-            <w:r>
-              <w:rPr>
-                <w:rFonts w:ascii="Consolas" w:eastAsia="Arial" w:hAnsi="Consolas" w:cs="Arial"/>
-              </w:rPr>
-              <w:t>prioridad</w:t>
-            </w:r>
-            <w:r>
-              <w:rPr>
-                <w:rFonts w:ascii="Consolas" w:eastAsia="Arial" w:hAnsi="Consolas" w:cs="Arial"/>
-              </w:rPr>
-              <w:t>,</w:t>
-            </w:r>
-            <w:r>
-              <w:rPr>
-                <w:rFonts w:ascii="Consolas" w:eastAsia="Arial" w:hAnsi="Consolas" w:cs="Arial"/>
-              </w:rPr>
-              <w:t>fecha</w:t>
-            </w:r>
-            <w:proofErr w:type="gramEnd"/>
-            <w:r>
-              <w:rPr>
-                <w:rFonts w:ascii="Consolas" w:eastAsia="Arial" w:hAnsi="Consolas" w:cs="Arial"/>
-              </w:rPr>
-              <w:t>_</w:t>
-            </w:r>
-            <w:proofErr w:type="gramStart"/>
-            <w:r>
-              <w:rPr>
-                <w:rFonts w:ascii="Consolas" w:eastAsia="Arial" w:hAnsi="Consolas" w:cs="Arial"/>
-              </w:rPr>
-              <w:t>limite</w:t>
-            </w:r>
-            <w:r>
-              <w:rPr>
-                <w:rFonts w:ascii="Consolas" w:eastAsia="Arial" w:hAnsi="Consolas" w:cs="Arial"/>
-              </w:rPr>
-              <w:t>,</w:t>
-            </w:r>
-            <w:r>
-              <w:rPr>
-                <w:rFonts w:ascii="Consolas" w:eastAsia="Arial" w:hAnsi="Consolas" w:cs="Arial"/>
-              </w:rPr>
-              <w:t>descripcion</w:t>
-            </w:r>
-            <w:proofErr w:type="gramEnd"/>
-            <w:r>
-              <w:rPr>
-                <w:rFonts w:ascii="Consolas" w:eastAsia="Arial" w:hAnsi="Consolas" w:cs="Arial"/>
-              </w:rPr>
-              <w:t>,id_</w:t>
-            </w:r>
-            <w:proofErr w:type="gramStart"/>
-            <w:r>
-              <w:rPr>
-                <w:rFonts w:ascii="Consolas" w:eastAsia="Arial" w:hAnsi="Consolas" w:cs="Arial"/>
-              </w:rPr>
-              <w:t>usuario[</w:t>
-            </w:r>
-            <w:proofErr w:type="gramEnd"/>
-            <w:r>
-              <w:rPr>
-                <w:rFonts w:ascii="Consolas" w:eastAsia="Arial" w:hAnsi="Consolas" w:cs="Arial"/>
-              </w:rPr>
-              <w:t>FK]</w:t>
-            </w:r>
-            <w:r>
-              <w:rPr>
-                <w:rFonts w:ascii="Consolas" w:eastAsia="Arial" w:hAnsi="Consolas" w:cs="Arial"/>
-              </w:rPr>
-              <w:t>)</w:t>
+              <w:t>tareas (titulo[PK],estado,prioridad,fecha_limite,descripcion,id_usuario[FK])</w:t>
             </w:r>
           </w:p>
         </w:tc>
@@ -5634,47 +4333,7 @@
               <w:rPr>
                 <w:rFonts w:ascii="Arial" w:eastAsia="Arial" w:hAnsi="Arial" w:cs="Arial"/>
               </w:rPr>
-              <w:t xml:space="preserve"> con el nombre de ‘tareas’. En las siguientes líneas se colocan los atributos correspondientes: titulo, como llave primaria y de tipo VARCHAR con límite de 25 caracteres; estado, que puede ser </w:t>
-            </w:r>
-            <w:r>
-              <w:rPr>
-                <w:rFonts w:ascii="Arial" w:eastAsia="Arial" w:hAnsi="Arial" w:cs="Arial"/>
-              </w:rPr>
-              <w:t>pendiente, en progreso, completada o cancelada</w:t>
-            </w:r>
-            <w:r>
-              <w:rPr>
-                <w:rFonts w:ascii="Arial" w:eastAsia="Arial" w:hAnsi="Arial" w:cs="Arial"/>
-              </w:rPr>
-              <w:t xml:space="preserve">; </w:t>
-            </w:r>
-            <w:proofErr w:type="spellStart"/>
-            <w:r>
-              <w:rPr>
-                <w:rFonts w:ascii="Arial" w:eastAsia="Arial" w:hAnsi="Arial" w:cs="Arial"/>
-              </w:rPr>
-              <w:t>fecha_limite</w:t>
-            </w:r>
-            <w:proofErr w:type="spellEnd"/>
-            <w:r>
-              <w:rPr>
-                <w:rFonts w:ascii="Arial" w:eastAsia="Arial" w:hAnsi="Arial" w:cs="Arial"/>
-              </w:rPr>
-              <w:t xml:space="preserve"> como TIMESTAMP; descripción como VARCHAR, y una llave foránea que apunta al </w:t>
-            </w:r>
-            <w:proofErr w:type="spellStart"/>
-            <w:r>
-              <w:rPr>
-                <w:rFonts w:ascii="Arial" w:eastAsia="Arial" w:hAnsi="Arial" w:cs="Arial"/>
-              </w:rPr>
-              <w:t>id_usuario</w:t>
-            </w:r>
-            <w:proofErr w:type="spellEnd"/>
-            <w:r>
-              <w:rPr>
-                <w:rFonts w:ascii="Arial" w:eastAsia="Arial" w:hAnsi="Arial" w:cs="Arial"/>
-              </w:rPr>
-              <w:t xml:space="preserve"> del usuario que gestiona la tarea. </w:t>
+              <w:t xml:space="preserve"> con el nombre de ‘tareas’. En las siguientes líneas se colocan los atributos correspondientes: titulo, como llave primaria y de tipo VARCHAR con límite de 25 caracteres; estado, que puede ser pendiente, en progreso, completada o cancelada; fecha_limite como TIMESTAMP; descripción como VARCHAR, y una llave foránea que apunta al id_usuario del usuario que gestiona la tarea. </w:t>
             </w:r>
           </w:p>
           <w:p>
@@ -5699,254 +4358,180 @@
                 <w:rFonts w:ascii="Consolas" w:eastAsia="Arial" w:hAnsi="Consolas" w:cs="Arial"/>
                 <w:lang w:val="en-US"/>
               </w:rPr>
-              <w:t xml:space="preserve">CREATE TABLE </w:t>
-            </w:r>
-            <w:proofErr w:type="spellStart"/>
-            <w:r>
+              <w:t>CREATE TABLE tareas (</w:t>
+            </w:r>
+          </w:p>
+          <w:p>
+            <w:pPr>
+              <w:jc w:val="both"/>
               <w:rPr>
                 <w:rFonts w:ascii="Consolas" w:eastAsia="Arial" w:hAnsi="Consolas" w:cs="Arial"/>
                 <w:lang w:val="en-US"/>
               </w:rPr>
-              <w:t>tareas</w:t>
-            </w:r>
-            <w:proofErr w:type="spellEnd"/>
+            </w:pPr>
             <w:r>
               <w:rPr>
                 <w:rFonts w:ascii="Consolas" w:eastAsia="Arial" w:hAnsi="Consolas" w:cs="Arial"/>
                 <w:lang w:val="en-US"/>
               </w:rPr>
-              <w:t xml:space="preserve"> (</w:t>
-            </w:r>
-          </w:p>
-          <w:p>
-            <w:pPr>
-              <w:jc w:val="both"/>
+              <w:t xml:space="preserve">    titulo </w:t>
+            </w:r>
+            <w:r>
               <w:rPr>
                 <w:rFonts w:ascii="Consolas" w:eastAsia="Arial" w:hAnsi="Consolas" w:cs="Arial"/>
                 <w:lang w:val="en-US"/>
               </w:rPr>
-            </w:pPr>
+              <w:t xml:space="preserve">VARCHAR(25) </w:t>
+            </w:r>
             <w:r>
               <w:rPr>
                 <w:rFonts w:ascii="Consolas" w:eastAsia="Arial" w:hAnsi="Consolas" w:cs="Arial"/>
                 <w:lang w:val="en-US"/>
               </w:rPr>
+              <w:t>PRIMARY KEY,</w:t>
+            </w:r>
+          </w:p>
+          <w:p>
+            <w:pPr>
+              <w:jc w:val="both"/>
+              <w:rPr>
+                <w:rFonts w:ascii="Consolas" w:eastAsia="Arial" w:hAnsi="Consolas" w:cs="Arial"/>
+              </w:rPr>
+            </w:pPr>
+            <w:r>
+              <w:rPr>
+                <w:rFonts w:ascii="Consolas" w:eastAsia="Arial" w:hAnsi="Consolas" w:cs="Arial"/>
+                <w:lang w:val="en-US"/>
+              </w:rPr>
               <w:t>    </w:t>
             </w:r>
-            <w:proofErr w:type="spellStart"/>
-            <w:r>
-              <w:rPr>
-                <w:rFonts w:ascii="Consolas" w:eastAsia="Arial" w:hAnsi="Consolas" w:cs="Arial"/>
-                <w:lang w:val="en-US"/>
-              </w:rPr>
-              <w:t>t</w:t>
-            </w:r>
-            <w:r>
-              <w:rPr>
-                <w:rFonts w:ascii="Consolas" w:eastAsia="Arial" w:hAnsi="Consolas" w:cs="Arial"/>
-                <w:lang w:val="en-US"/>
-              </w:rPr>
-              <w:t>i</w:t>
-            </w:r>
-            <w:r>
-              <w:rPr>
-                <w:rFonts w:ascii="Consolas" w:eastAsia="Arial" w:hAnsi="Consolas" w:cs="Arial"/>
-                <w:lang w:val="en-US"/>
-              </w:rPr>
-              <w:t>tulo</w:t>
-            </w:r>
-            <w:proofErr w:type="spellEnd"/>
-            <w:r>
-              <w:rPr>
-                <w:rFonts w:ascii="Consolas" w:eastAsia="Arial" w:hAnsi="Consolas" w:cs="Arial"/>
-                <w:lang w:val="en-US"/>
+            <w:r>
+              <w:rPr>
+                <w:rFonts w:ascii="Consolas" w:eastAsia="Arial" w:hAnsi="Consolas" w:cs="Arial"/>
+              </w:rPr>
+              <w:t xml:space="preserve">estado </w:t>
+            </w:r>
+            <w:r>
+              <w:rPr>
+                <w:rFonts w:ascii="Consolas" w:eastAsia="Arial" w:hAnsi="Consolas" w:cs="Arial"/>
+              </w:rPr>
+              <w:t xml:space="preserve">VARCHAR(15) </w:t>
+            </w:r>
+            <w:r>
+              <w:rPr>
+                <w:rFonts w:ascii="Consolas" w:eastAsia="Arial" w:hAnsi="Consolas" w:cs="Arial"/>
+              </w:rPr>
+              <w:t>NOT NULL,</w:t>
+            </w:r>
+          </w:p>
+          <w:p>
+            <w:pPr>
+              <w:jc w:val="both"/>
+              <w:rPr>
+                <w:rFonts w:ascii="Consolas" w:eastAsia="Arial" w:hAnsi="Consolas" w:cs="Arial"/>
+              </w:rPr>
+            </w:pPr>
+            <w:r>
+              <w:rPr>
+                <w:rFonts w:ascii="Consolas" w:eastAsia="Arial" w:hAnsi="Consolas" w:cs="Arial"/>
+              </w:rPr>
+              <w:t xml:space="preserve">    prioridad </w:t>
+            </w:r>
+            <w:r>
+              <w:rPr>
+                <w:rFonts w:ascii="Consolas" w:eastAsia="Arial" w:hAnsi="Consolas" w:cs="Arial"/>
+              </w:rPr>
+              <w:t xml:space="preserve">VARCHAR(20) </w:t>
+            </w:r>
+            <w:r>
+              <w:rPr>
+                <w:rFonts w:ascii="Consolas" w:eastAsia="Arial" w:hAnsi="Consolas" w:cs="Arial"/>
+              </w:rPr>
+              <w:t>NOT NULL,</w:t>
+            </w:r>
+          </w:p>
+          <w:p>
+            <w:pPr>
+              <w:jc w:val="both"/>
+              <w:rPr>
+                <w:rFonts w:ascii="Consolas" w:eastAsia="Arial" w:hAnsi="Consolas" w:cs="Arial"/>
+              </w:rPr>
+            </w:pPr>
+            <w:r>
+              <w:rPr>
+                <w:rFonts w:ascii="Consolas" w:eastAsia="Arial" w:hAnsi="Consolas" w:cs="Arial"/>
+              </w:rPr>
+              <w:t xml:space="preserve">    </w:t>
+            </w:r>
+            <w:r>
+              <w:rPr>
+                <w:rFonts w:ascii="Consolas" w:eastAsia="Arial" w:hAnsi="Consolas" w:cs="Arial"/>
+              </w:rPr>
+              <w:t>fecha_limite TIMESTAMP</w:t>
+            </w:r>
+            <w:r>
+              <w:rPr>
+                <w:rFonts w:ascii="Consolas" w:eastAsia="Arial" w:hAnsi="Consolas" w:cs="Arial"/>
+              </w:rPr>
+              <w:t xml:space="preserve"> NOT NULL,</w:t>
+            </w:r>
+          </w:p>
+          <w:p>
+            <w:pPr>
+              <w:jc w:val="both"/>
+              <w:rPr>
+                <w:rFonts w:ascii="Consolas" w:eastAsia="Arial" w:hAnsi="Consolas" w:cs="Arial"/>
+              </w:rPr>
+            </w:pPr>
+            <w:r>
+              <w:rPr>
+                <w:rFonts w:ascii="Consolas" w:eastAsia="Arial" w:hAnsi="Consolas" w:cs="Arial"/>
+              </w:rPr>
+              <w:t xml:space="preserve">    descripcion VARCHAR(50),</w:t>
+            </w:r>
+          </w:p>
+          <w:p>
+            <w:pPr>
+              <w:jc w:val="both"/>
+              <w:rPr>
+                <w:rFonts w:ascii="Consolas" w:eastAsia="Arial" w:hAnsi="Consolas" w:cs="Arial"/>
+              </w:rPr>
+            </w:pPr>
+            <w:r>
+              <w:rPr>
+                <w:rFonts w:ascii="Consolas" w:eastAsia="Arial" w:hAnsi="Consolas" w:cs="Arial"/>
+              </w:rPr>
+              <w:t xml:space="preserve">    id_u</w:t>
+            </w:r>
+            <w:r>
+              <w:rPr>
+                <w:rFonts w:ascii="Consolas" w:eastAsia="Arial" w:hAnsi="Consolas" w:cs="Arial"/>
+              </w:rPr>
+              <w:t>suario</w:t>
+            </w:r>
+            <w:r>
+              <w:rPr>
+                <w:rFonts w:ascii="Consolas" w:eastAsia="Arial" w:hAnsi="Consolas" w:cs="Arial"/>
               </w:rPr>
               <w:t xml:space="preserve"> </w:t>
             </w:r>
-            <w:proofErr w:type="gramStart"/>
-            <w:r>
-              <w:rPr>
-                <w:rFonts w:ascii="Consolas" w:eastAsia="Arial" w:hAnsi="Consolas" w:cs="Arial"/>
-                <w:lang w:val="en-US"/>
-              </w:rPr>
-              <w:t>VARCHAR(</w:t>
-            </w:r>
-            <w:proofErr w:type="gramEnd"/>
-            <w:r>
-              <w:rPr>
-                <w:rFonts w:ascii="Consolas" w:eastAsia="Arial" w:hAnsi="Consolas" w:cs="Arial"/>
-                <w:lang w:val="en-US"/>
-              </w:rPr>
-              <w:t xml:space="preserve">25) </w:t>
-            </w:r>
-            <w:r>
-              <w:rPr>
-                <w:rFonts w:ascii="Consolas" w:eastAsia="Arial" w:hAnsi="Consolas" w:cs="Arial"/>
-                <w:lang w:val="en-US"/>
-              </w:rPr>
-              <w:t>PRIMARY KEY,</w:t>
-            </w:r>
-          </w:p>
-          <w:p>
-            <w:pPr>
-              <w:jc w:val="both"/>
-              <w:rPr>
-                <w:rFonts w:ascii="Consolas" w:eastAsia="Arial" w:hAnsi="Consolas" w:cs="Arial"/>
-                <w:lang w:val="en-US"/>
-              </w:rPr>
-            </w:pPr>
-            <w:r>
-              <w:rPr>
-                <w:rFonts w:ascii="Consolas" w:eastAsia="Arial" w:hAnsi="Consolas" w:cs="Arial"/>
-                <w:lang w:val="en-US"/>
-              </w:rPr>
-              <w:t>    </w:t>
-            </w:r>
-            <w:proofErr w:type="spellStart"/>
-            <w:r>
-              <w:rPr>
-                <w:rFonts w:ascii="Consolas" w:eastAsia="Arial" w:hAnsi="Consolas" w:cs="Arial"/>
-                <w:lang w:val="en-US"/>
-              </w:rPr>
-              <w:t>estado</w:t>
-            </w:r>
-            <w:proofErr w:type="spellEnd"/>
-            <w:r>
-              <w:rPr>
-                <w:rFonts w:ascii="Consolas" w:eastAsia="Arial" w:hAnsi="Consolas" w:cs="Arial"/>
-                <w:lang w:val="en-US"/>
-              </w:rPr>
-              <w:t xml:space="preserve"> NOT NULL,</w:t>
-            </w:r>
-          </w:p>
-          <w:p>
-            <w:pPr>
-              <w:jc w:val="both"/>
-              <w:rPr>
-                <w:rFonts w:ascii="Consolas" w:eastAsia="Arial" w:hAnsi="Consolas" w:cs="Arial"/>
-                <w:lang w:val="en-US"/>
-              </w:rPr>
-            </w:pPr>
-            <w:r>
-              <w:rPr>
-                <w:rFonts w:ascii="Consolas" w:eastAsia="Arial" w:hAnsi="Consolas" w:cs="Arial"/>
-                <w:lang w:val="en-US"/>
-              </w:rPr>
-              <w:t>    </w:t>
-            </w:r>
-            <w:proofErr w:type="spellStart"/>
-            <w:r>
-              <w:rPr>
-                <w:rFonts w:ascii="Consolas" w:eastAsia="Arial" w:hAnsi="Consolas" w:cs="Arial"/>
-                <w:lang w:val="en-US"/>
-              </w:rPr>
-              <w:t>prioridad</w:t>
-            </w:r>
-            <w:proofErr w:type="spellEnd"/>
-            <w:r>
-              <w:rPr>
-                <w:rFonts w:ascii="Consolas" w:eastAsia="Arial" w:hAnsi="Consolas" w:cs="Arial"/>
-                <w:lang w:val="en-US"/>
-              </w:rPr>
-              <w:t xml:space="preserve"> NOT NULL,</w:t>
-            </w:r>
-          </w:p>
-          <w:p>
-            <w:pPr>
-              <w:jc w:val="both"/>
-              <w:rPr>
-                <w:rFonts w:ascii="Consolas" w:eastAsia="Arial" w:hAnsi="Consolas" w:cs="Arial"/>
-              </w:rPr>
-            </w:pPr>
-            <w:r>
-              <w:rPr>
-                <w:rFonts w:ascii="Consolas" w:eastAsia="Arial" w:hAnsi="Consolas" w:cs="Arial"/>
-                <w:lang w:val="en-US"/>
-              </w:rPr>
-              <w:t xml:space="preserve">    </w:t>
-            </w:r>
-            <w:proofErr w:type="spellStart"/>
-            <w:r>
-              <w:rPr>
-                <w:rFonts w:ascii="Consolas" w:eastAsia="Arial" w:hAnsi="Consolas" w:cs="Arial"/>
-              </w:rPr>
-              <w:t>fecha_limite</w:t>
-            </w:r>
-            <w:proofErr w:type="spellEnd"/>
-            <w:r>
-              <w:rPr>
-                <w:rFonts w:ascii="Consolas" w:eastAsia="Arial" w:hAnsi="Consolas" w:cs="Arial"/>
-              </w:rPr>
-              <w:t xml:space="preserve"> TIMESTAMP</w:t>
-            </w:r>
-            <w:r>
-              <w:rPr>
-                <w:rFonts w:ascii="Consolas" w:eastAsia="Arial" w:hAnsi="Consolas" w:cs="Arial"/>
-              </w:rPr>
-              <w:t xml:space="preserve"> NOT NULL,</w:t>
-            </w:r>
-          </w:p>
-          <w:p>
-            <w:pPr>
-              <w:jc w:val="both"/>
-              <w:rPr>
-                <w:rFonts w:ascii="Consolas" w:eastAsia="Arial" w:hAnsi="Consolas" w:cs="Arial"/>
-              </w:rPr>
-            </w:pPr>
-            <w:r>
-              <w:rPr>
-                <w:rFonts w:ascii="Consolas" w:eastAsia="Arial" w:hAnsi="Consolas" w:cs="Arial"/>
-              </w:rPr>
-              <w:t xml:space="preserve">    </w:t>
-            </w:r>
-            <w:proofErr w:type="spellStart"/>
-            <w:r>
-              <w:rPr>
-                <w:rFonts w:ascii="Consolas" w:eastAsia="Arial" w:hAnsi="Consolas" w:cs="Arial"/>
-              </w:rPr>
-              <w:t>descripcion</w:t>
-            </w:r>
-            <w:proofErr w:type="spellEnd"/>
-            <w:r>
-              <w:rPr>
-                <w:rFonts w:ascii="Consolas" w:eastAsia="Arial" w:hAnsi="Consolas" w:cs="Arial"/>
-              </w:rPr>
-              <w:t xml:space="preserve"> </w:t>
-            </w:r>
-            <w:proofErr w:type="gramStart"/>
-            <w:r>
-              <w:rPr>
-                <w:rFonts w:ascii="Consolas" w:eastAsia="Arial" w:hAnsi="Consolas" w:cs="Arial"/>
-              </w:rPr>
-              <w:t>VARCHAR(</w:t>
-            </w:r>
-            <w:proofErr w:type="gramEnd"/>
-            <w:r>
-              <w:rPr>
-                <w:rFonts w:ascii="Consolas" w:eastAsia="Arial" w:hAnsi="Consolas" w:cs="Arial"/>
-              </w:rPr>
-              <w:t>50),</w:t>
-            </w:r>
-          </w:p>
-          <w:p>
-            <w:pPr>
-              <w:jc w:val="both"/>
-              <w:rPr>
-                <w:rFonts w:ascii="Consolas" w:eastAsia="Arial" w:hAnsi="Consolas" w:cs="Arial"/>
-              </w:rPr>
-            </w:pPr>
-            <w:r>
-              <w:rPr>
-                <w:rFonts w:ascii="Consolas" w:eastAsia="Arial" w:hAnsi="Consolas" w:cs="Arial"/>
-              </w:rPr>
-              <w:t xml:space="preserve">    </w:t>
-            </w:r>
-            <w:proofErr w:type="spellStart"/>
-            <w:r>
-              <w:rPr>
-                <w:rFonts w:ascii="Consolas" w:eastAsia="Arial" w:hAnsi="Consolas" w:cs="Arial"/>
-              </w:rPr>
-              <w:t>id_u</w:t>
+            <w:r>
+              <w:rPr>
+                <w:rFonts w:ascii="Consolas" w:eastAsia="Arial" w:hAnsi="Consolas" w:cs="Arial"/>
+              </w:rPr>
+              <w:t>REFERENCES u</w:t>
+            </w:r>
+            <w:r>
+              <w:rPr>
+                <w:rFonts w:ascii="Consolas" w:eastAsia="Arial" w:hAnsi="Consolas" w:cs="Arial"/>
+              </w:rPr>
+              <w:t>suarios</w:t>
+            </w:r>
+            <w:r>
+              <w:rPr>
+                <w:rFonts w:ascii="Consolas" w:eastAsia="Arial" w:hAnsi="Consolas" w:cs="Arial"/>
+              </w:rPr>
+              <w:t>(id_u</w:t>
             </w:r>
             <w:r>
               <w:rPr>
@@ -5954,39 +4539,6 @@
               </w:rPr>
               <w:t>suario</w:t>
             </w:r>
-            <w:proofErr w:type="spellEnd"/>
-            <w:r>
-              <w:rPr>
-                <w:rFonts w:ascii="Consolas" w:eastAsia="Arial" w:hAnsi="Consolas" w:cs="Arial"/>
-              </w:rPr>
-              <w:t xml:space="preserve"> SERIAL REFERENCES u</w:t>
-            </w:r>
-            <w:r>
-              <w:rPr>
-                <w:rFonts w:ascii="Consolas" w:eastAsia="Arial" w:hAnsi="Consolas" w:cs="Arial"/>
-              </w:rPr>
-              <w:t>suarios</w:t>
-            </w:r>
-            <w:r>
-              <w:rPr>
-                <w:rFonts w:ascii="Consolas" w:eastAsia="Arial" w:hAnsi="Consolas" w:cs="Arial"/>
-              </w:rPr>
-              <w:t>(</w:t>
-            </w:r>
-            <w:proofErr w:type="spellStart"/>
-            <w:r>
-              <w:rPr>
-                <w:rFonts w:ascii="Consolas" w:eastAsia="Arial" w:hAnsi="Consolas" w:cs="Arial"/>
-              </w:rPr>
-              <w:t>id_u</w:t>
-            </w:r>
-            <w:r>
-              <w:rPr>
-                <w:rFonts w:ascii="Consolas" w:eastAsia="Arial" w:hAnsi="Consolas" w:cs="Arial"/>
-              </w:rPr>
-              <w:t>suario</w:t>
-            </w:r>
-            <w:proofErr w:type="spellEnd"/>
             <w:r>
               <w:rPr>
                 <w:rFonts w:ascii="Consolas" w:eastAsia="Arial" w:hAnsi="Consolas" w:cs="Arial"/>
@@ -6121,15 +4673,7 @@
                 <w:bCs/>
               </w:rPr>
               <w:lastRenderedPageBreak/>
-              <w:t>RF-1</w:t>
-            </w:r>
-            <w:r>
-              <w:rPr>
-                <w:rFonts w:ascii="Arial" w:eastAsia="Arial" w:hAnsi="Arial" w:cs="Arial"/>
-                <w:b/>
-                <w:bCs/>
-              </w:rPr>
-              <w:t>6</w:t>
+              <w:t>RF-16</w:t>
             </w:r>
           </w:p>
         </w:tc>
@@ -6254,8 +4798,199 @@
               <w:jc w:val="both"/>
               <w:rPr>
                 <w:rFonts w:ascii="Arial" w:eastAsia="Arial" w:hAnsi="Arial" w:cs="Arial"/>
+              </w:rPr>
+            </w:pPr>
+            <w:r>
+              <w:rPr>
+                <w:rFonts w:ascii="Arial" w:eastAsia="Arial" w:hAnsi="Arial" w:cs="Arial"/>
+              </w:rPr>
+              <w:t>Primero, se utiliza el c</w:t>
+            </w:r>
+            <w:r>
+              <w:rPr>
+                <w:rFonts w:ascii="Arial" w:eastAsia="Arial" w:hAnsi="Arial" w:cs="Arial"/>
+              </w:rPr>
+              <w:t xml:space="preserve">omando </w:t>
+            </w:r>
+            <w:r>
+              <w:rPr>
+                <w:rFonts w:ascii="Consolas" w:eastAsia="Arial" w:hAnsi="Consolas" w:cs="Arial"/>
+              </w:rPr>
+              <w:t>SELECT</w:t>
+            </w:r>
+            <w:r>
+              <w:rPr>
+                <w:rFonts w:ascii="Arial" w:eastAsia="Arial" w:hAnsi="Arial" w:cs="Arial"/>
+              </w:rPr>
+              <w:t xml:space="preserve"> y </w:t>
+            </w:r>
+            <w:r>
+              <w:rPr>
+                <w:rFonts w:ascii="Consolas" w:eastAsia="Arial" w:hAnsi="Consolas" w:cs="Arial"/>
+              </w:rPr>
+              <w:t>FROM</w:t>
+            </w:r>
+            <w:r>
+              <w:rPr>
+                <w:rFonts w:ascii="Arial" w:eastAsia="Arial" w:hAnsi="Arial" w:cs="Arial"/>
+              </w:rPr>
+              <w:t xml:space="preserve"> para seleccionar los datos de la tabla tareas. Luego se utiliza </w:t>
+            </w:r>
+            <w:r>
+              <w:rPr>
+                <w:rFonts w:ascii="Consolas" w:eastAsia="Arial" w:hAnsi="Consolas" w:cs="Arial"/>
+              </w:rPr>
+              <w:t>WHERE</w:t>
+            </w:r>
+            <w:r>
+              <w:rPr>
+                <w:rFonts w:ascii="Arial" w:eastAsia="Arial" w:hAnsi="Arial" w:cs="Arial"/>
+              </w:rPr>
+              <w:t xml:space="preserve"> para detectar aquellas donde el atributo de estado sea igual a “pendiente”.</w:t>
+            </w:r>
+            <w:r>
+              <w:rPr>
+                <w:rFonts w:ascii="Arial" w:eastAsia="Arial" w:hAnsi="Arial" w:cs="Arial"/>
+              </w:rPr>
+              <w:t xml:space="preserve"> Lo mismo se aplica para las tareas en que su estado sea “progreso”</w:t>
+            </w:r>
+          </w:p>
+          <w:p>
+            <w:pPr>
+              <w:ind w:right="-108"/>
+              <w:jc w:val="both"/>
+              <w:rPr>
+                <w:rFonts w:ascii="Consolas" w:eastAsia="Arial" w:hAnsi="Consolas" w:cs="Arial"/>
+              </w:rPr>
+            </w:pPr>
+          </w:p>
+          <w:p>
+            <w:pPr>
+              <w:ind w:right="-108"/>
+              <w:jc w:val="both"/>
+              <w:rPr>
+                <w:rFonts w:ascii="Consolas" w:eastAsia="Arial" w:hAnsi="Consolas" w:cs="Arial"/>
+                <w:lang w:val="en-US"/>
+              </w:rPr>
+            </w:pPr>
+            <w:r>
+              <w:rPr>
+                <w:rFonts w:ascii="Consolas" w:eastAsia="Arial" w:hAnsi="Consolas" w:cs="Arial"/>
+                <w:lang w:val="en-US"/>
+              </w:rPr>
+              <w:t xml:space="preserve">SELECT </w:t>
+            </w:r>
+            <w:r>
+              <w:rPr>
+                <w:rFonts w:ascii="Consolas" w:eastAsia="Arial" w:hAnsi="Consolas" w:cs="Arial"/>
+                <w:lang w:val="en-US"/>
+              </w:rPr>
+              <w:t xml:space="preserve">* </w:t>
+            </w:r>
+            <w:r>
+              <w:rPr>
+                <w:rFonts w:ascii="Consolas" w:eastAsia="Arial" w:hAnsi="Consolas" w:cs="Arial"/>
+                <w:lang w:val="en-US"/>
+              </w:rPr>
+              <w:t xml:space="preserve">FROM tareas WHERE estado </w:t>
+            </w:r>
+            <w:r>
+              <w:rPr>
+                <w:rFonts w:ascii="Consolas" w:eastAsia="Arial" w:hAnsi="Consolas" w:cs="Arial"/>
+                <w:lang w:val="en-US"/>
+              </w:rPr>
+              <w:t>=</w:t>
+            </w:r>
+            <w:r>
+              <w:rPr>
+                <w:rFonts w:ascii="Consolas" w:eastAsia="Arial" w:hAnsi="Consolas" w:cs="Arial"/>
+                <w:lang w:val="en-US"/>
+              </w:rPr>
+              <w:t xml:space="preserve"> ‘</w:t>
+            </w:r>
+            <w:r>
+              <w:rPr>
+                <w:rFonts w:ascii="Consolas" w:eastAsia="Arial" w:hAnsi="Consolas" w:cs="Arial"/>
+                <w:lang w:val="en-US"/>
+              </w:rPr>
+              <w:t>pendiente’</w:t>
+            </w:r>
+            <w:r>
+              <w:rPr>
+                <w:rFonts w:ascii="Consolas" w:eastAsia="Arial" w:hAnsi="Consolas" w:cs="Arial"/>
+                <w:lang w:val="en-US"/>
+              </w:rPr>
+              <w:t>;</w:t>
+            </w:r>
+          </w:p>
+          <w:p>
+            <w:pPr>
+              <w:ind w:right="-108"/>
+              <w:jc w:val="both"/>
+              <w:rPr>
+                <w:rFonts w:ascii="Consolas" w:eastAsia="Arial" w:hAnsi="Consolas" w:cs="Arial"/>
+                <w:lang w:val="en-US"/>
+              </w:rPr>
+            </w:pPr>
+            <w:r>
+              <w:rPr>
+                <w:rFonts w:ascii="Consolas" w:eastAsia="Arial" w:hAnsi="Consolas" w:cs="Arial"/>
+                <w:lang w:val="en-US"/>
+              </w:rPr>
+              <w:t xml:space="preserve">SELECT </w:t>
+            </w:r>
+            <w:r>
+              <w:rPr>
+                <w:rFonts w:ascii="Consolas" w:eastAsia="Arial" w:hAnsi="Consolas" w:cs="Arial"/>
+                <w:lang w:val="en-US"/>
+              </w:rPr>
+              <w:t xml:space="preserve">* </w:t>
+            </w:r>
+            <w:r>
+              <w:rPr>
+                <w:rFonts w:ascii="Consolas" w:eastAsia="Arial" w:hAnsi="Consolas" w:cs="Arial"/>
+                <w:lang w:val="en-US"/>
+              </w:rPr>
+              <w:t xml:space="preserve">FROM tareas WHERE estado </w:t>
+            </w:r>
+            <w:r>
+              <w:rPr>
+                <w:rFonts w:ascii="Consolas" w:eastAsia="Arial" w:hAnsi="Consolas" w:cs="Arial"/>
+                <w:lang w:val="en-US"/>
+              </w:rPr>
+              <w:t>=</w:t>
+            </w:r>
+            <w:r>
+              <w:rPr>
+                <w:rFonts w:ascii="Consolas" w:eastAsia="Arial" w:hAnsi="Consolas" w:cs="Arial"/>
+                <w:lang w:val="en-US"/>
+              </w:rPr>
+              <w:t xml:space="preserve"> ‘</w:t>
+            </w:r>
+            <w:r>
+              <w:rPr>
+                <w:rFonts w:ascii="Consolas" w:eastAsia="Arial" w:hAnsi="Consolas" w:cs="Arial"/>
+                <w:lang w:val="en-US"/>
+              </w:rPr>
+              <w:t>progreso’</w:t>
+            </w:r>
+            <w:r>
+              <w:rPr>
+                <w:rFonts w:ascii="Consolas" w:eastAsia="Arial" w:hAnsi="Consolas" w:cs="Arial"/>
+                <w:lang w:val="en-US"/>
+              </w:rPr>
+              <w:t>;</w:t>
+            </w:r>
+          </w:p>
+          <w:p>
+            <w:pPr>
+              <w:ind w:right="-108"/>
+              <w:jc w:val="both"/>
+              <w:rPr>
+                <w:rFonts w:ascii="Arial" w:eastAsia="Arial" w:hAnsi="Arial" w:cs="Arial"/>
                 <w:b/>
                 <w:bCs/>
+                <w:lang w:val="en-US"/>
               </w:rPr>
             </w:pPr>
           </w:p>
@@ -6371,15 +5106,7 @@
                 <w:bCs/>
               </w:rPr>
               <w:lastRenderedPageBreak/>
-              <w:t>RF-1</w:t>
-            </w:r>
-            <w:r>
-              <w:rPr>
-                <w:rFonts w:ascii="Arial" w:eastAsia="Arial" w:hAnsi="Arial" w:cs="Arial"/>
-                <w:b/>
-                <w:bCs/>
-              </w:rPr>
-              <w:t>7</w:t>
+              <w:t>RF-17</w:t>
             </w:r>
           </w:p>
         </w:tc>
@@ -6504,8 +5231,118 @@
               <w:jc w:val="both"/>
               <w:rPr>
                 <w:rFonts w:ascii="Arial" w:eastAsia="Arial" w:hAnsi="Arial" w:cs="Arial"/>
-                <w:b/>
-                <w:bCs/>
+              </w:rPr>
+            </w:pPr>
+            <w:r>
+              <w:rPr>
+                <w:rFonts w:ascii="Arial" w:eastAsia="Arial" w:hAnsi="Arial" w:cs="Arial"/>
+              </w:rPr>
+              <w:t>Primero, se utiliza el c</w:t>
+            </w:r>
+            <w:r>
+              <w:rPr>
+                <w:rFonts w:ascii="Arial" w:eastAsia="Arial" w:hAnsi="Arial" w:cs="Arial"/>
+              </w:rPr>
+              <w:t xml:space="preserve">omando </w:t>
+            </w:r>
+            <w:r>
+              <w:rPr>
+                <w:rFonts w:ascii="Consolas" w:eastAsia="Arial" w:hAnsi="Consolas" w:cs="Arial"/>
+              </w:rPr>
+              <w:t>SELECT</w:t>
+            </w:r>
+            <w:r>
+              <w:rPr>
+                <w:rFonts w:ascii="Arial" w:eastAsia="Arial" w:hAnsi="Arial" w:cs="Arial"/>
+              </w:rPr>
+              <w:t xml:space="preserve"> y </w:t>
+            </w:r>
+            <w:r>
+              <w:rPr>
+                <w:rFonts w:ascii="Consolas" w:eastAsia="Arial" w:hAnsi="Consolas" w:cs="Arial"/>
+              </w:rPr>
+              <w:t>FROM</w:t>
+            </w:r>
+            <w:r>
+              <w:rPr>
+                <w:rFonts w:ascii="Arial" w:eastAsia="Arial" w:hAnsi="Arial" w:cs="Arial"/>
+              </w:rPr>
+              <w:t xml:space="preserve"> para seleccionar los datos de la tabla tareas. Luego se utiliza </w:t>
+            </w:r>
+            <w:r>
+              <w:rPr>
+                <w:rFonts w:ascii="Consolas" w:eastAsia="Arial" w:hAnsi="Consolas" w:cs="Arial"/>
+              </w:rPr>
+              <w:t>WHERE</w:t>
+            </w:r>
+            <w:r>
+              <w:rPr>
+                <w:rFonts w:ascii="Arial" w:eastAsia="Arial" w:hAnsi="Arial" w:cs="Arial"/>
+              </w:rPr>
+              <w:t xml:space="preserve"> para detectar aquellas donde el atributo de estado sea igual a “pendiente”. Lo mismo se aplica para las tareas en que su estado sea “progreso”</w:t>
+            </w:r>
+          </w:p>
+          <w:p>
+            <w:pPr>
+              <w:ind w:right="-108"/>
+              <w:jc w:val="both"/>
+              <w:rPr>
+                <w:rFonts w:ascii="Consolas" w:eastAsia="Arial" w:hAnsi="Consolas" w:cs="Arial"/>
+              </w:rPr>
+            </w:pPr>
+          </w:p>
+          <w:p>
+            <w:pPr>
+              <w:ind w:right="-108"/>
+              <w:jc w:val="both"/>
+              <w:rPr>
+                <w:rFonts w:ascii="Consolas" w:eastAsia="Arial" w:hAnsi="Consolas" w:cs="Arial"/>
+                <w:lang w:val="en-US"/>
+              </w:rPr>
+            </w:pPr>
+            <w:r>
+              <w:rPr>
+                <w:rFonts w:ascii="Consolas" w:eastAsia="Arial" w:hAnsi="Consolas" w:cs="Arial"/>
+                <w:lang w:val="en-US"/>
+              </w:rPr>
+              <w:t>SELECT * FROM tareas WHERE fecha_</w:t>
+            </w:r>
+            <w:r>
+              <w:rPr>
+                <w:rFonts w:ascii="Consolas" w:eastAsia="Arial" w:hAnsi="Consolas" w:cs="Arial"/>
+                <w:lang w:val="en-US"/>
+              </w:rPr>
+              <w:t>limite</w:t>
+            </w:r>
+            <w:r>
+              <w:rPr>
+                <w:rFonts w:ascii="Consolas" w:eastAsia="Arial" w:hAnsi="Consolas" w:cs="Arial"/>
+                <w:lang w:val="en-US"/>
+              </w:rPr>
+              <w:t xml:space="preserve"> &lt; CURRENT_TIME</w:t>
+            </w:r>
+            <w:r>
+              <w:rPr>
+                <w:rFonts w:ascii="Consolas" w:eastAsia="Arial" w:hAnsi="Consolas" w:cs="Arial"/>
+                <w:lang w:val="en-US"/>
+              </w:rPr>
+              <w:t>STAMP;</w:t>
+            </w:r>
+            <w:r>
+              <w:rPr>
+                <w:rFonts w:ascii="Consolas" w:eastAsia="Arial" w:hAnsi="Consolas" w:cs="Arial"/>
+                <w:lang w:val="en-US"/>
+              </w:rPr>
+              <w:t xml:space="preserve"> </w:t>
+            </w:r>
+          </w:p>
+          <w:p>
+            <w:pPr>
+              <w:ind w:right="-108"/>
+              <w:jc w:val="both"/>
+              <w:rPr>
+                <w:rFonts w:ascii="Consolas" w:eastAsia="Arial" w:hAnsi="Consolas" w:cs="Arial"/>
+                <w:lang w:val="en-US"/>
               </w:rPr>
             </w:pPr>
           </w:p>
@@ -7069,39 +5906,7 @@
                 <w:rFonts w:ascii="Arial" w:hAnsi="Arial" w:cs="Arial"/>
                 <w:color w:val="000000"/>
               </w:rPr>
-              <w:t xml:space="preserve">Definir la entidad ubicaciones y sus atributos obligatorios desde la interfaz: </w:t>
-            </w:r>
-            <w:proofErr w:type="spellStart"/>
-            <w:r>
-              <w:rPr>
-                <w:rFonts w:ascii="Arial" w:hAnsi="Arial" w:cs="Arial"/>
-                <w:color w:val="000000"/>
-              </w:rPr>
-              <w:t>id_ubicacion</w:t>
-            </w:r>
-            <w:proofErr w:type="spellEnd"/>
-            <w:r>
-              <w:rPr>
-                <w:rFonts w:ascii="Arial" w:hAnsi="Arial" w:cs="Arial"/>
-                <w:color w:val="000000"/>
-              </w:rPr>
-              <w:t xml:space="preserve"> (PK), nombre, </w:t>
-            </w:r>
-            <w:proofErr w:type="spellStart"/>
-            <w:r>
-              <w:rPr>
-                <w:rFonts w:ascii="Arial" w:hAnsi="Arial" w:cs="Arial"/>
-                <w:color w:val="000000"/>
-              </w:rPr>
-              <w:t>direccion</w:t>
-            </w:r>
-            <w:proofErr w:type="spellEnd"/>
-            <w:r>
-              <w:rPr>
-                <w:rFonts w:ascii="Arial" w:hAnsi="Arial" w:cs="Arial"/>
-                <w:color w:val="000000"/>
-              </w:rPr>
-              <w:t>, ciudad y capacidad.</w:t>
+              <w:t>Definir la entidad ubicaciones y sus atributos obligatorios desde la interfaz: id_ubicacion (PK), nombre, direccion, ciudad y capacidad.</w:t>
             </w:r>
           </w:p>
         </w:tc>
@@ -7435,23 +6240,7 @@
                 <w:rFonts w:ascii="Arial" w:hAnsi="Arial" w:cs="Arial"/>
                 <w:color w:val="000000"/>
               </w:rPr>
-              <w:t xml:space="preserve">Establecer la relación de cardinalidad entre la entidad Eventos y la entidad ubicaciones mediante la clave foránea </w:t>
-            </w:r>
-            <w:proofErr w:type="spellStart"/>
-            <w:r>
-              <w:rPr>
-                <w:rFonts w:ascii="Arial" w:hAnsi="Arial" w:cs="Arial"/>
-                <w:color w:val="000000"/>
-              </w:rPr>
-              <w:t>id_ubicacion</w:t>
-            </w:r>
-            <w:proofErr w:type="spellEnd"/>
-            <w:r>
-              <w:rPr>
-                <w:rFonts w:ascii="Arial" w:hAnsi="Arial" w:cs="Arial"/>
-                <w:color w:val="000000"/>
-              </w:rPr>
-              <w:t>.</w:t>
+              <w:t>Establecer la relación de cardinalidad entre la entidad Eventos y la entidad ubicaciones mediante la clave foránea id_ubicacion.</w:t>
             </w:r>
           </w:p>
         </w:tc>
@@ -7533,23 +6322,7 @@
                 <w:rFonts w:ascii="Arial" w:hAnsi="Arial" w:cs="Arial"/>
                 <w:color w:val="000000"/>
               </w:rPr>
-              <w:t xml:space="preserve">Incorporar el atributo </w:t>
-            </w:r>
-            <w:proofErr w:type="spellStart"/>
-            <w:r>
-              <w:rPr>
-                <w:rFonts w:ascii="Arial" w:hAnsi="Arial" w:cs="Arial"/>
-                <w:color w:val="000000"/>
-              </w:rPr>
-              <w:t>id_ubicacion</w:t>
-            </w:r>
-            <w:proofErr w:type="spellEnd"/>
-            <w:r>
-              <w:rPr>
-                <w:rFonts w:ascii="Arial" w:hAnsi="Arial" w:cs="Arial"/>
-                <w:color w:val="000000"/>
-              </w:rPr>
-              <w:t xml:space="preserve"> como Clave Foránea (FK) en el esquema relacional de eventos para estructurar consultas complejas.</w:t>
+              <w:t>Incorporar el atributo id_ubicacion como Clave Foránea (FK) en el esquema relacional de eventos para estructurar consultas complejas.</w:t>
             </w:r>
           </w:p>
         </w:tc>
@@ -7974,23 +6747,7 @@
                 <w:rFonts w:ascii="Arial" w:hAnsi="Arial" w:cs="Arial"/>
                 <w:color w:val="000000"/>
               </w:rPr>
-              <w:t xml:space="preserve">Definir la entidad disponibilidades vinculada al perfil del usuario y el catálogo </w:t>
-            </w:r>
-            <w:proofErr w:type="spellStart"/>
-            <w:r>
-              <w:rPr>
-                <w:rFonts w:ascii="Arial" w:hAnsi="Arial" w:cs="Arial"/>
-                <w:color w:val="000000"/>
-              </w:rPr>
-              <w:t>tipos_disponibilidad</w:t>
-            </w:r>
-            <w:proofErr w:type="spellEnd"/>
-            <w:r>
-              <w:rPr>
-                <w:rFonts w:ascii="Arial" w:hAnsi="Arial" w:cs="Arial"/>
-                <w:color w:val="000000"/>
-              </w:rPr>
-              <w:t xml:space="preserve"> con sus atributos obligatorios de fecha y horas.</w:t>
+              <w:t>Definir la entidad disponibilidades vinculada al perfil del usuario y el catálogo tipos_disponibilidad con sus atributos obligatorios de fecha y horas.</w:t>
             </w:r>
           </w:p>
         </w:tc>
@@ -8076,23 +6833,7 @@
                 <w:rFonts w:ascii="Arial" w:hAnsi="Arial" w:cs="Arial"/>
                 <w:color w:val="000000"/>
               </w:rPr>
-              <w:t xml:space="preserve">Estructurar las tablas relacionales para el control de disponibilidades y su clave </w:t>
-            </w:r>
-            <w:proofErr w:type="spellStart"/>
-            <w:r>
-              <w:rPr>
-                <w:rFonts w:ascii="Arial" w:hAnsi="Arial" w:cs="Arial"/>
-                <w:color w:val="000000"/>
-              </w:rPr>
-              <w:t>foranea</w:t>
-            </w:r>
-            <w:proofErr w:type="spellEnd"/>
-            <w:r>
-              <w:rPr>
-                <w:rFonts w:ascii="Arial" w:hAnsi="Arial" w:cs="Arial"/>
-                <w:color w:val="000000"/>
-              </w:rPr>
-              <w:t xml:space="preserve"> hacia usuarios.</w:t>
+              <w:t>Estructurar las tablas relacionales para el control de disponibilidades y su clave foranea hacia usuarios.</w:t>
             </w:r>
           </w:p>
         </w:tc>
@@ -9430,6 +8171,14 @@
           <w:bCs/>
         </w:rPr>
       </w:pPr>
+      <w:r>
+        <w:rPr>
+          <w:rFonts w:ascii="Arial" w:eastAsia="Arial" w:hAnsi="Arial" w:cs="Arial"/>
+          <w:b/>
+          <w:bCs/>
+        </w:rPr>
+        <w:t xml:space="preserve">1. </w:t>
+      </w:r>
       <w:r>
         <w:rPr>
           <w:rFonts w:ascii="Arial" w:eastAsia="Arial" w:hAnsi="Arial" w:cs="Arial"/>
@@ -9936,6 +8685,15 @@
     </w:p>
     <w:p>
       <w:pPr>
+        <w:spacing w:after="0" w:line="240" w:lineRule="auto"/>
+        <w:ind w:left="-1418" w:right="-141"/>
+        <w:rPr>
+          <w:rFonts w:ascii="Arial" w:eastAsia="Arial" w:hAnsi="Arial" w:cs="Arial"/>
+        </w:rPr>
+      </w:pPr>
+    </w:p>
+    <w:p>
+      <w:pPr>
         <w:rPr>
           <w:rFonts w:ascii="Arial" w:eastAsia="Arial" w:hAnsi="Arial" w:cs="Arial"/>
         </w:rPr>
@@ -9974,16 +8732,10 @@
       </w:pPr>
       <w:r>
         <w:rPr>
-          <w:rFonts w:ascii="Arial" w:eastAsia="Arial" w:hAnsi="Arial" w:cs="Arial"/>
-        </w:rPr>
-        <w:br/>
-      </w:r>
-      <w:r>
-        <w:rPr>
           <w:noProof/>
         </w:rPr>
         <w:drawing>
-          <wp:inline distT="0" distB="0" distL="0" distR="0" wp14:anchorId="51F1B158" wp14:editId="402D5742">
+          <wp:inline distT="0" distB="0" distL="0" distR="0" wp14:anchorId="7844CDF2" wp14:editId="029DAEBC">
             <wp:extent cx="4312693" cy="4082683"/>
             <wp:effectExtent l="0" t="0" r="0" b="0"/>
             <wp:docPr id="1971178040" name="Imagen 1"/>
@@ -10023,30 +8775,59 @@
       <w:pPr>
         <w:spacing w:after="0" w:line="240" w:lineRule="auto"/>
         <w:ind w:left="-1418" w:right="-141"/>
-        <w:rPr>
-          <w:rFonts w:ascii="Arial" w:eastAsia="Arial" w:hAnsi="Arial" w:cs="Arial"/>
-          <w:b/>
-          <w:bCs/>
+        <w:jc w:val="center"/>
+        <w:rPr>
+          <w:rFonts w:ascii="Arial" w:eastAsia="Arial" w:hAnsi="Arial" w:cs="Arial"/>
         </w:rPr>
       </w:pPr>
     </w:p>
     <w:p>
       <w:pPr>
+        <w:rPr>
+          <w:rFonts w:ascii="Arial" w:eastAsia="Arial" w:hAnsi="Arial" w:cs="Arial"/>
+          <w:b/>
+          <w:bCs/>
+        </w:rPr>
+      </w:pPr>
+      <w:r>
+        <w:rPr>
+          <w:rFonts w:ascii="Arial" w:eastAsia="Arial" w:hAnsi="Arial" w:cs="Arial"/>
+          <w:b/>
+          <w:bCs/>
+        </w:rPr>
+        <w:br w:type="page"/>
+      </w:r>
+    </w:p>
+    <w:p>
+      <w:pPr>
         <w:spacing w:after="0" w:line="240" w:lineRule="auto"/>
         <w:ind w:left="-1418" w:right="-141"/>
-        <w:rPr>
-          <w:rFonts w:ascii="Arial" w:eastAsia="Arial" w:hAnsi="Arial" w:cs="Arial"/>
-          <w:b/>
-          <w:bCs/>
-        </w:rPr>
-      </w:pPr>
+        <w:jc w:val="both"/>
+        <w:rPr>
+          <w:rFonts w:ascii="Arial" w:eastAsia="Arial" w:hAnsi="Arial" w:cs="Arial"/>
+          <w:b/>
+          <w:bCs/>
+        </w:rPr>
+      </w:pPr>
+      <w:r>
+        <w:rPr>
+          <w:rFonts w:ascii="Arial" w:eastAsia="Arial" w:hAnsi="Arial" w:cs="Arial"/>
+          <w:b/>
+          <w:bCs/>
+        </w:rPr>
+        <w:lastRenderedPageBreak/>
+        <w:t>2. Evidencias de implementación de tablas en base de datos:</w:t>
+      </w:r>
     </w:p>
     <w:p>
       <w:pPr>
         <w:spacing w:after="0" w:line="240" w:lineRule="auto"/>
         <w:ind w:left="-1418" w:right="-141"/>
-        <w:rPr>
-          <w:rFonts w:ascii="Arial" w:eastAsia="Arial" w:hAnsi="Arial" w:cs="Arial"/>
+        <w:jc w:val="center"/>
+        <w:rPr>
+          <w:rFonts w:ascii="Arial" w:eastAsia="Arial" w:hAnsi="Arial" w:cs="Arial"/>
+          <w:b/>
+          <w:bCs/>
         </w:rPr>
       </w:pPr>
     </w:p>
@@ -10054,17 +8835,63 @@
       <w:pPr>
         <w:spacing w:after="0" w:line="240" w:lineRule="auto"/>
         <w:ind w:left="-1418" w:right="-141"/>
-        <w:rPr>
-          <w:rFonts w:ascii="Arial" w:eastAsia="Arial" w:hAnsi="Arial" w:cs="Arial"/>
-        </w:rPr>
-      </w:pPr>
+        <w:jc w:val="center"/>
+        <w:rPr>
+          <w:rFonts w:ascii="Arial" w:eastAsia="Arial" w:hAnsi="Arial" w:cs="Arial"/>
+          <w:b/>
+          <w:bCs/>
+        </w:rPr>
+      </w:pPr>
+      <w:r>
+        <w:rPr>
+          <w:noProof/>
+        </w:rPr>
+        <w:drawing>
+          <wp:inline distT="0" distB="0" distL="0" distR="0" wp14:anchorId="2474B183" wp14:editId="41FAE0D6">
+            <wp:extent cx="4839419" cy="3677285"/>
+            <wp:effectExtent l="0" t="0" r="0" b="0"/>
+            <wp:docPr id="1549567408" name="Imagen 1"/>
+            <wp:cNvGraphicFramePr>
+              <a:graphicFrameLocks xmlns:a="http://schemas.openxmlformats.org/drawingml/2006/main" noChangeAspect="1"/>
+            </wp:cNvGraphicFramePr>
+            <a:graphic xmlns:a="http://schemas.openxmlformats.org/drawingml/2006/main">
+              <a:graphicData uri="http://schemas.openxmlformats.org/drawingml/2006/picture">
+                <pic:pic xmlns:pic="http://schemas.openxmlformats.org/drawingml/2006/picture">
+                  <pic:nvPicPr>
+                    <pic:cNvPr id="1549567408" name=""/>
+                    <pic:cNvPicPr/>
+                  </pic:nvPicPr>
+                  <pic:blipFill>
+                    <a:blip r:embed="rId23"/>
+                    <a:stretch>
+                      <a:fillRect/>
+                    </a:stretch>
+                  </pic:blipFill>
+                  <pic:spPr>
+                    <a:xfrm>
+                      <a:off x="0" y="0"/>
+                      <a:ext cx="4843844" cy="3680647"/>
+                    </a:xfrm>
+                    <a:prstGeom prst="rect">
+                      <a:avLst/>
+                    </a:prstGeom>
+                  </pic:spPr>
+                </pic:pic>
+              </a:graphicData>
+            </a:graphic>
+          </wp:inline>
+        </w:drawing>
+      </w:r>
     </w:p>
     <w:p>
       <w:pPr>
         <w:spacing w:after="0" w:line="240" w:lineRule="auto"/>
         <w:ind w:left="-1418" w:right="-141"/>
-        <w:rPr>
-          <w:rFonts w:ascii="Arial" w:eastAsia="Arial" w:hAnsi="Arial" w:cs="Arial"/>
+        <w:jc w:val="center"/>
+        <w:rPr>
+          <w:rFonts w:ascii="Arial" w:eastAsia="Arial" w:hAnsi="Arial" w:cs="Arial"/>
+          <w:b/>
+          <w:bCs/>
         </w:rPr>
       </w:pPr>
     </w:p>
@@ -10072,14 +8899,255 @@
       <w:pPr>
         <w:spacing w:after="0" w:line="240" w:lineRule="auto"/>
         <w:ind w:left="-1418" w:right="-141"/>
+        <w:jc w:val="center"/>
+        <w:rPr>
+          <w:rFonts w:ascii="Arial" w:eastAsia="Arial" w:hAnsi="Arial" w:cs="Arial"/>
+          <w:b/>
+          <w:bCs/>
+        </w:rPr>
+      </w:pPr>
+      <w:r>
+        <w:rPr>
+          <w:noProof/>
+        </w:rPr>
+        <w:drawing>
+          <wp:inline distT="0" distB="0" distL="0" distR="0" wp14:anchorId="386AA090" wp14:editId="61D63146">
+            <wp:extent cx="5520906" cy="3302670"/>
+            <wp:effectExtent l="0" t="0" r="3810" b="0"/>
+            <wp:docPr id="239653363" name="Imagen 1"/>
+            <wp:cNvGraphicFramePr>
+              <a:graphicFrameLocks xmlns:a="http://schemas.openxmlformats.org/drawingml/2006/main" noChangeAspect="1"/>
+            </wp:cNvGraphicFramePr>
+            <a:graphic xmlns:a="http://schemas.openxmlformats.org/drawingml/2006/main">
+              <a:graphicData uri="http://schemas.openxmlformats.org/drawingml/2006/picture">
+                <pic:pic xmlns:pic="http://schemas.openxmlformats.org/drawingml/2006/picture">
+                  <pic:nvPicPr>
+                    <pic:cNvPr id="239653363" name=""/>
+                    <pic:cNvPicPr/>
+                  </pic:nvPicPr>
+                  <pic:blipFill>
+                    <a:blip r:embed="rId24"/>
+                    <a:stretch>
+                      <a:fillRect/>
+                    </a:stretch>
+                  </pic:blipFill>
+                  <pic:spPr>
+                    <a:xfrm>
+                      <a:off x="0" y="0"/>
+                      <a:ext cx="5522880" cy="3303851"/>
+                    </a:xfrm>
+                    <a:prstGeom prst="rect">
+                      <a:avLst/>
+                    </a:prstGeom>
+                  </pic:spPr>
+                </pic:pic>
+              </a:graphicData>
+            </a:graphic>
+          </wp:inline>
+        </w:drawing>
+      </w:r>
+    </w:p>
+    <w:p>
+      <w:pPr>
+        <w:spacing w:after="0" w:line="240" w:lineRule="auto"/>
+        <w:ind w:left="-1418" w:right="-141"/>
+        <w:jc w:val="center"/>
+        <w:rPr>
+          <w:rFonts w:ascii="Arial" w:eastAsia="Arial" w:hAnsi="Arial" w:cs="Arial"/>
+          <w:b/>
+          <w:bCs/>
+        </w:rPr>
+      </w:pPr>
+      <w:r>
+        <w:rPr>
+          <w:noProof/>
+        </w:rPr>
+        <w:lastRenderedPageBreak/>
+        <w:drawing>
+          <wp:inline distT="0" distB="0" distL="0" distR="0" wp14:anchorId="62DFDAA0" wp14:editId="527D4537">
+            <wp:extent cx="4978785" cy="3674853"/>
+            <wp:effectExtent l="0" t="0" r="0" b="1905"/>
+            <wp:docPr id="822339338" name="Imagen 1"/>
+            <wp:cNvGraphicFramePr>
+              <a:graphicFrameLocks xmlns:a="http://schemas.openxmlformats.org/drawingml/2006/main" noChangeAspect="1"/>
+            </wp:cNvGraphicFramePr>
+            <a:graphic xmlns:a="http://schemas.openxmlformats.org/drawingml/2006/main">
+              <a:graphicData uri="http://schemas.openxmlformats.org/drawingml/2006/picture">
+                <pic:pic xmlns:pic="http://schemas.openxmlformats.org/drawingml/2006/picture">
+                  <pic:nvPicPr>
+                    <pic:cNvPr id="822339338" name=""/>
+                    <pic:cNvPicPr/>
+                  </pic:nvPicPr>
+                  <pic:blipFill>
+                    <a:blip r:embed="rId25"/>
+                    <a:stretch>
+                      <a:fillRect/>
+                    </a:stretch>
+                  </pic:blipFill>
+                  <pic:spPr>
+                    <a:xfrm>
+                      <a:off x="0" y="0"/>
+                      <a:ext cx="4983990" cy="3678695"/>
+                    </a:xfrm>
+                    <a:prstGeom prst="rect">
+                      <a:avLst/>
+                    </a:prstGeom>
+                  </pic:spPr>
+                </pic:pic>
+              </a:graphicData>
+            </a:graphic>
+          </wp:inline>
+        </w:drawing>
+      </w:r>
+    </w:p>
+    <w:p>
+      <w:pPr>
+        <w:spacing w:after="0" w:line="240" w:lineRule="auto"/>
+        <w:ind w:left="-1418" w:right="-141"/>
+        <w:jc w:val="center"/>
+        <w:rPr>
+          <w:rFonts w:ascii="Arial" w:eastAsia="Arial" w:hAnsi="Arial" w:cs="Arial"/>
+          <w:b/>
+          <w:bCs/>
+        </w:rPr>
+      </w:pPr>
+    </w:p>
+    <w:p>
+      <w:pPr>
+        <w:spacing w:after="0" w:line="240" w:lineRule="auto"/>
+        <w:ind w:left="-1418" w:right="-141"/>
+        <w:jc w:val="center"/>
+        <w:rPr>
+          <w:rFonts w:ascii="Arial" w:eastAsia="Arial" w:hAnsi="Arial" w:cs="Arial"/>
+          <w:b/>
+          <w:bCs/>
+        </w:rPr>
+      </w:pPr>
+      <w:r>
+        <w:rPr>
+          <w:noProof/>
+        </w:rPr>
+        <w:drawing>
+          <wp:inline distT="0" distB="0" distL="0" distR="0" wp14:anchorId="099E649C" wp14:editId="2C9922FF">
+            <wp:extent cx="4710023" cy="3516724"/>
+            <wp:effectExtent l="0" t="0" r="0" b="7620"/>
+            <wp:docPr id="599707162" name="Imagen 1"/>
+            <wp:cNvGraphicFramePr>
+              <a:graphicFrameLocks xmlns:a="http://schemas.openxmlformats.org/drawingml/2006/main" noChangeAspect="1"/>
+            </wp:cNvGraphicFramePr>
+            <a:graphic xmlns:a="http://schemas.openxmlformats.org/drawingml/2006/main">
+              <a:graphicData uri="http://schemas.openxmlformats.org/drawingml/2006/picture">
+                <pic:pic xmlns:pic="http://schemas.openxmlformats.org/drawingml/2006/picture">
+                  <pic:nvPicPr>
+                    <pic:cNvPr id="599707162" name=""/>
+                    <pic:cNvPicPr/>
+                  </pic:nvPicPr>
+                  <pic:blipFill>
+                    <a:blip r:embed="rId26"/>
+                    <a:stretch>
+                      <a:fillRect/>
+                    </a:stretch>
+                  </pic:blipFill>
+                  <pic:spPr>
+                    <a:xfrm>
+                      <a:off x="0" y="0"/>
+                      <a:ext cx="4715130" cy="3520537"/>
+                    </a:xfrm>
+                    <a:prstGeom prst="rect">
+                      <a:avLst/>
+                    </a:prstGeom>
+                  </pic:spPr>
+                </pic:pic>
+              </a:graphicData>
+            </a:graphic>
+          </wp:inline>
+        </w:drawing>
+      </w:r>
+    </w:p>
+    <w:p>
+      <w:pPr>
+        <w:rPr>
+          <w:rFonts w:ascii="Arial" w:eastAsia="Arial" w:hAnsi="Arial" w:cs="Arial"/>
+        </w:rPr>
+      </w:pPr>
+      <w:r>
+        <w:rPr>
+          <w:rFonts w:ascii="Arial" w:eastAsia="Arial" w:hAnsi="Arial" w:cs="Arial"/>
+        </w:rPr>
+        <w:br w:type="page"/>
+      </w:r>
+    </w:p>
+    <w:p>
+      <w:pPr>
+        <w:spacing w:after="0" w:line="240" w:lineRule="auto"/>
+        <w:ind w:left="-1418" w:right="-141"/>
+        <w:jc w:val="center"/>
+        <w:rPr>
+          <w:rFonts w:ascii="Arial" w:eastAsia="Arial" w:hAnsi="Arial" w:cs="Arial"/>
+        </w:rPr>
+      </w:pPr>
+    </w:p>
+    <w:p>
+      <w:pPr>
+        <w:spacing w:after="0" w:line="240" w:lineRule="auto"/>
+        <w:ind w:left="-1418" w:right="-141"/>
+        <w:rPr>
+          <w:rFonts w:ascii="Arial" w:eastAsia="Arial" w:hAnsi="Arial" w:cs="Arial"/>
+          <w:b/>
+          <w:bCs/>
+        </w:rPr>
+      </w:pPr>
+    </w:p>
+    <w:p>
+      <w:pPr>
+        <w:spacing w:after="0" w:line="240" w:lineRule="auto"/>
+        <w:ind w:left="-1418" w:right="-141"/>
+        <w:rPr>
+          <w:rFonts w:ascii="Arial" w:eastAsia="Arial" w:hAnsi="Arial" w:cs="Arial"/>
+          <w:b/>
+          <w:bCs/>
+        </w:rPr>
+      </w:pPr>
+    </w:p>
+    <w:p>
+      <w:pPr>
+        <w:spacing w:after="0" w:line="240" w:lineRule="auto"/>
+        <w:ind w:left="-1418" w:right="-141"/>
+        <w:rPr>
+          <w:rFonts w:ascii="Arial" w:eastAsia="Arial" w:hAnsi="Arial" w:cs="Arial"/>
+        </w:rPr>
+      </w:pPr>
+    </w:p>
+    <w:p>
+      <w:pPr>
+        <w:spacing w:after="0" w:line="240" w:lineRule="auto"/>
+        <w:ind w:left="-1418" w:right="-141"/>
+        <w:rPr>
+          <w:rFonts w:ascii="Arial" w:eastAsia="Arial" w:hAnsi="Arial" w:cs="Arial"/>
+        </w:rPr>
+      </w:pPr>
+    </w:p>
+    <w:p>
+      <w:pPr>
+        <w:spacing w:after="0" w:line="240" w:lineRule="auto"/>
+        <w:ind w:left="-1418" w:right="-141"/>
+        <w:rPr>
+          <w:rFonts w:ascii="Arial" w:eastAsia="Arial" w:hAnsi="Arial" w:cs="Arial"/>
+        </w:rPr>
+      </w:pPr>
+    </w:p>
+    <w:p>
+      <w:pPr>
+        <w:spacing w:after="0" w:line="240" w:lineRule="auto"/>
+        <w:ind w:left="-1418" w:right="-141"/>
         <w:rPr>
           <w:rFonts w:ascii="Arial" w:eastAsia="Arial" w:hAnsi="Arial" w:cs="Arial"/>
         </w:rPr>
       </w:pPr>
     </w:p>
     <w:sectPr>
-      <w:headerReference w:type="default" r:id="rId23"/>
-      <w:footerReference w:type="default" r:id="rId24"/>
+      <w:headerReference w:type="default" r:id="rId27"/>
+      <w:footerReference w:type="default" r:id="rId28"/>
       <w:pgSz w:w="12240" w:h="15840"/>
       <w:pgMar w:top="1134" w:right="474" w:bottom="1417" w:left="1701" w:header="708" w:footer="708" w:gutter="0"/>
       <w:pgNumType w:start="1"/>
@@ -14311,6 +13379,7 @@
   <w:style w:type="character" w:default="1" w:styleId="Fuentedeprrafopredeter">
     <w:name w:val="Default Paragraph Font"/>
     <w:uiPriority w:val="1"/>
+    <w:semiHidden/>
     <w:unhideWhenUsed/>
   </w:style>
   <w:style w:type="table" w:default="1" w:styleId="Tablanormal">

</xml_diff>